<commit_message>
Fix scope decision wording: ESB/DWH are widened, not the only surviving channels
User clarified: all 4 pilot sources (DWH, ESB/CRM, MCP-server, "RAG-компании") stay in project scope. Only ESB and DWH get expanded (more marts/APIs); MCP-server and "RAG-компании" remain at pilot level, not descoped. Corrected §2, question 9, and proposal 1 which had wrongly implied the other two pilot sources were being dropped. Rebuilt docx.

Co-Authored-By: Claude Sonnet 5 <noreply@anthropic.com>
Claude-Session: https://claude.ai/code/session_01DpSN8JwCJ3tg3JVUadr2zE
</commit_message>
<xml_diff>
--- a/docs/analysis/case-27-proekt-d8-skoup-i-voprosy.docx
+++ b/docs/analysis/case-27-proekt-d8-skoup-i-voprosy.docx
@@ -508,30 +508,30 @@
     </w:p>
     <w:p>
       <w:r>
-        <w:t xml:space="preserve">Заказчик хочет </w:t>
+        <w:t xml:space="preserve">Уточнение формулировки: все 4 пилотных источника (КХД, ESB/CRM Bitrix24, MCP-сервер, «RAG-компании») </w:t>
       </w:r>
       <w:r>
         <w:rPr>
           <w:b/>
         </w:rPr>
-        <w:t>оставить два канала интеграции</w:t>
+        <w:t>остаются в скоупе проекта</w:t>
       </w:r>
       <w:r>
-        <w:t xml:space="preserve"> — шину (ESB) и хранилище (КХД/DWH), не добавлять новые типы источников (Excel/CSV напрямую, Email, Confluence и т.д. — во всяком случае не как отдельные новые коннекторы). Вместо расширения числа источников — </w:t>
+        <w:t xml:space="preserve"> — ничего из них не выводится. Но </w:t>
       </w:r>
       <w:r>
         <w:rPr>
           <w:b/>
         </w:rPr>
-        <w:t>расширить внутри шины</w:t>
+        <w:t>ESB и КХД — основные каналы, которые расширяются</w:t>
       </w:r>
       <w:r>
-        <w:t>: больше витрин данных и больше API, доступных через ESB.</w:t>
+        <w:t>: больше витрин данных и больше API внутри шины, плюс, видимо, более широкий периметр самого хранилища. MCP-сервер и «RAG-компании» остаются в проекте как есть, на пилотном уровне — без заявленного расширения (если не появится отдельного запроса).</w:t>
       </w:r>
     </w:p>
     <w:p>
       <w:r>
-        <w:t>Это меняет форму фазы П2 методики: не «подключить 7 источников», а «углубить 1 источник (ESB) — от текущего CRM-среза до более широкого набора витрин/API» + сохранить КХД как есть. Существенно сужает и, вероятно, удешевляет техническую часть готовности интеграции по сравнению с мастер-ТЗ.</w:t>
+        <w:t>Это меняет форму фазы П2 методики: не «подключить N новых источников», а «углубить 2 из 4 уже подключённых источника (ESB, КХД) — расширить витрины/API» при сохранении MCP-сервера и «RAG-компании» на текущем уровне. Источники из мастер-ТЗ, не входившие в пилот (Excel/CSV напрямую, Email, Confluence, отдельный back-office-коннектор) — по-прежнему не подтверждены и не затронуты этим решением ни в одну, ни в другую сторону (см. вопрос 9).</w:t>
       </w:r>
     </w:p>
     <w:p>
@@ -1042,12 +1042,12 @@
         <w:pStyle w:val="Heading3"/>
       </w:pPr>
       <w:r>
-        <w:t>Источники данных вне ESB/КХД</w:t>
+        <w:t>Источники данных вне пилотных четырёх</w:t>
       </w:r>
     </w:p>
     <w:p>
       <w:r>
-        <w:t>9. Email, Word/PDF-регламенты, Confluence из мастер-ТЗ (§1.2) — подтверждается ли, что они НЕ входят в проект (раз заказчик остаётся на двух каналах), или это отдельный вопрос на будущее, не решённый окончательно?</w:t>
+        <w:t>9. Email, Word/PDF-регламенты, Confluence из мастер-ТЗ (§1.2) — они не входили в пилот и не затронуты решением расширять ESB/КХД. Подтверждается ли, что они НЕ входят и в проект, или это отдельный вопрос, который ещё предстоит решить?</w:t>
       </w:r>
     </w:p>
     <w:p>
@@ -1142,20 +1142,10 @@
         <w:rPr>
           <w:b/>
         </w:rPr>
-        <w:t>ESB/КХД-решение заказчика — зафиксировать как формальное сужение скоупа, а не устное пожелание.</w:t>
+        <w:t>Решение по ESB/КХД зафиксировать письменно как есть — расширение, не сужение.</w:t>
       </w:r>
       <w:r>
-        <w:t xml:space="preserve"> Предлагаем оформить отдельным пунктом в проектном ТЗ: «Email, Word/PDF-регламенты, Confluence, прямой Excel/CSV-коннектор — вне скоупа проекта». Это заодно закрывает старый пробел пилота (Email был Must Have в мастер-ТЗ без единого теста, </w:t>
-      </w:r>
-      <w:r>
-        <w:rPr>
-          <w:rFonts w:ascii="Consolas" w:hAnsi="Consolas"/>
-          <w:sz w:val="20"/>
-        </w:rPr>
-        <w:t>TC-EMAIL</w:t>
-      </w:r>
-      <w:r>
-        <w:t>) — не техническим долгом, а осознанным решением, зафиксированным письменно.</w:t>
+        <w:t xml:space="preserve"> Предлагаем формулировку для проектного ТЗ: «Все 4 пилотных источника (КХД, ESB/CRM, MCP-сервер, «RAG-компании») остаются в проекте; ESB и КХД получают расширение (витрины/API), MCP-сервер и «RAG-компании» — на пилотном уровне». Источники вне пилотной четвёрки (Email, Word/PDF-регламенты, Confluence, прямой Excel/CSV) — отдельный, пока не решённый вопрос (см. вопрос 9), не путать с этим решением.</w:t>
       </w:r>
     </w:p>
     <w:p>

</xml_diff>

<commit_message>
Resolve RAG-компании as typo/duplicate, drop from scope; add project waves section
RAG-компании removed from the source list (3 pilot sources now, not 4) per customer's call this session. Added new §3 "Волны проекта" as the primary open question: customer specified wave 1 = RAG-документы, wave 2 = ESB/DWH expansion, waves 3+ still open ("уточнить какие дальше"). Flagged three possible readings of wave 1 (new document types / quality improvement of existing collections / new dedicated collection) as needing a clarifying call, same pattern used for the earlier RAG-компании ambiguity. Renumbered questions and proposals throughout, fixed a pre-existing wrong cross-reference in the wave-order proposal (was pointing at the wrong question number). Rebuilt docx.

Co-Authored-By: Claude Sonnet 5 <noreply@anthropic.com>
Claude-Session: https://claude.ai/code/session_01DpSN8JwCJ3tg3JVUadr2zE
</commit_message>
<xml_diff>
--- a/docs/analysis/case-27-proekt-d8-skoup-i-voprosy.docx
+++ b/docs/analysis/case-27-proekt-d8-skoup-i-voprosy.docx
@@ -28,7 +28,7 @@
         <w:t>docs/metodika-vnedreniya.md</w:t>
       </w:r>
       <w:r>
-        <w:t>, Кейс 2 — Проект) к конкретному кандидату — АО «Инвестиционная компания Д8», единственному клиенту в базе, реально прошедшему пилот достаточно далеко, чтобы обсуждать масштабирование. Ниже — то, что уже известно из пилотного ТЗ и разбора мастер-ТЗ, что подтвердил заказчик в этой сессии, и открытые вопросы, которые нужно закрыть до фазы П2 («Целевая архитектура и волны роллаута»).</w:t>
+        <w:t>, Кейс 2 — Проект) к конкретному кандидату — АО «Инвестиционная компания Д8», единственному клиенту в базе, реально прошедшему пилот достаточно далеко, чтобы обсуждать масштабирование. Ниже — то, что уже известно из пилотного ТЗ и разбора мастер-ТЗ, что подтвердил заказчик в этой сессии, черновая карта волн проекта, и открытые вопросы, которые нужно закрыть до фазы П2 («Целевая архитектура и волны роллаута»).</w:t>
       </w:r>
     </w:p>
     <w:p>
@@ -54,7 +54,7 @@
     </w:p>
     <w:p>
       <w:r>
-        <w:t xml:space="preserve">4 источника данных (КХД, CRM Bitrix24 через ESB, MCP-сервер, «RAG-компании» — статус не уточнён), 2 согласованные роли из «до 5 в перспективе», 2 коллекции документов, до 20 пилотных пользователей. Источник: </w:t>
+        <w:t xml:space="preserve">3 источника данных (КХД, CRM Bitrix24 через ESB, MCP-сервер), 2 согласованные роли из «до 5 в перспективе», 2 коллекции документов, до 20 пилотных пользователей. Источник: </w:t>
       </w:r>
       <w:r>
         <w:rPr>
@@ -75,6 +75,30 @@
       </w:r>
       <w:r>
         <w:t>.</w:t>
+      </w:r>
+    </w:p>
+    <w:p>
+      <w:r>
+        <w:t>Пилотное ТЗ изначально называло и четвёртый источник — «RAG-компании» — как отдельный пункт с открытым статусом (</w:t>
+      </w:r>
+      <w:r>
+        <w:rPr>
+          <w:rFonts w:ascii="Consolas" w:hAnsi="Consolas"/>
+          <w:sz w:val="20"/>
+        </w:rPr>
+        <w:t>case-03-pilot-tz-ai-guard.md:29,83</w:t>
+      </w:r>
+      <w:r>
+        <w:t xml:space="preserve">: «не до конца ясно, идёт ли речь о самостоятельном RAG-продукте Д8... или это просто дублирующее название той же платформы»). </w:t>
+      </w:r>
+      <w:r>
+        <w:rPr>
+          <w:b/>
+        </w:rPr>
+        <w:t>Резолюция 14.09.2026:</w:t>
+      </w:r>
+      <w:r>
+        <w:t xml:space="preserve"> заказчик считает это, скорее всего, опечаткой/дублирующим названием, не отдельной системой — убрано из скоупа как самостоятельный источник (подробнее — §2).</w:t>
       </w:r>
     </w:p>
     <w:p>
@@ -508,7 +532,7 @@
     </w:p>
     <w:p>
       <w:r>
-        <w:t xml:space="preserve">Уточнение формулировки: все 4 пилотных источника (КХД, ESB/CRM Bitrix24, MCP-сервер, «RAG-компании») </w:t>
+        <w:t xml:space="preserve">Все 3 пилотных источника (КХД, ESB/CRM Bitrix24, MCP-сервер) </w:t>
       </w:r>
       <w:r>
         <w:rPr>
@@ -517,7 +541,7 @@
         <w:t>остаются в скоупе проекта</w:t>
       </w:r>
       <w:r>
-        <w:t xml:space="preserve"> — ничего из них не выводится. Но </w:t>
+        <w:t xml:space="preserve"> — ничего из них не выводится. </w:t>
       </w:r>
       <w:r>
         <w:rPr>
@@ -526,12 +550,23 @@
         <w:t>ESB и КХД — основные каналы, которые расширяются</w:t>
       </w:r>
       <w:r>
-        <w:t>: больше витрин данных и больше API внутри шины, плюс, видимо, более широкий периметр самого хранилища. MCP-сервер и «RAG-компании» остаются в проекте как есть, на пилотном уровне — без заявленного расширения (если не появится отдельного запроса).</w:t>
+        <w:t>: больше витрин данных и больше API внутри шины, плюс, видимо, более широкий периметр самого хранилища. MCP-сервер остаётся в проекте как есть, на пилотном уровне — без заявленного расширения (если не появится отдельного запроса).</w:t>
       </w:r>
     </w:p>
     <w:p>
       <w:r>
-        <w:t>Это меняет форму фазы П2 методики: не «подключить N новых источников», а «углубить 2 из 4 уже подключённых источника (ESB, КХД) — расширить витрины/API» при сохранении MCP-сервера и «RAG-компании» на текущем уровне. Источники из мастер-ТЗ, не входившие в пилот (Excel/CSV напрямую, Email, Confluence, отдельный back-office-коннектор) — по-прежнему не подтверждены и не затронуты этим решением ни в одну, ни в другую сторону (см. вопрос 9).</w:t>
+        <w:rPr>
+          <w:b/>
+        </w:rPr>
+        <w:t>Резолюция по «RAG-компании»:</w:t>
+      </w:r>
+      <w:r>
+        <w:t xml:space="preserve"> заказчик подтвердил, что формулировка в пилотном ТЗ — скорее всего опечатка или дублирующее название пилотного контура, а не отдельная система. Убрано из скоупа как самостоятельный источник; снимает открытый вопрос, тянувшийся с пилотного ТЗ.</w:t>
+      </w:r>
+    </w:p>
+    <w:p>
+      <w:r>
+        <w:t>Источники из мастер-ТЗ, не входившие в пилот (Excel/CSV напрямую, Email, Confluence, отдельный back-office-коннектор) — по-прежнему не подтверждены и не затронуты этим решением ни в одну, ни в другую сторону (см. вопрос 9).</w:t>
       </w:r>
     </w:p>
     <w:p>
@@ -544,7 +579,280 @@
         <w:pStyle w:val="Heading2"/>
       </w:pPr>
       <w:r>
-        <w:t>3. Реестр открытых платформенных пунктов (скриншот трекера, эта сессия)</w:t>
+        <w:t>3. Волны проекта — черновая карта (главный открытый вопрос)</w:t>
+      </w:r>
+    </w:p>
+    <w:p>
+      <w:r>
+        <w:t>Заказчик задал порядок первых двух волн; дальнейшие волны прямо помечены как требующие уточнения.</w:t>
+      </w:r>
+    </w:p>
+    <w:tbl>
+      <w:tblPr>
+        <w:tblStyle w:val="TableGrid"/>
+        <w:tblW w:type="auto" w:w="0"/>
+        <w:tblLook w:firstColumn="1" w:firstRow="1" w:lastColumn="0" w:lastRow="0" w:noHBand="0" w:noVBand="1" w:val="04A0"/>
+      </w:tblPr>
+      <w:tblGrid>
+        <w:gridCol w:w="2880"/>
+        <w:gridCol w:w="2880"/>
+        <w:gridCol w:w="2880"/>
+      </w:tblGrid>
+      <w:tr>
+        <w:tc>
+          <w:tcPr>
+            <w:tcW w:type="dxa" w:w="2880"/>
+          </w:tcPr>
+          <w:p>
+            <w:r>
+              <w:rPr>
+                <w:b/>
+              </w:rPr>
+              <w:t>Волна</w:t>
+            </w:r>
+          </w:p>
+        </w:tc>
+        <w:tc>
+          <w:tcPr>
+            <w:tcW w:type="dxa" w:w="2880"/>
+          </w:tcPr>
+          <w:p>
+            <w:r>
+              <w:rPr>
+                <w:b/>
+              </w:rPr>
+              <w:t>Содержание</w:t>
+            </w:r>
+          </w:p>
+        </w:tc>
+        <w:tc>
+          <w:tcPr>
+            <w:tcW w:type="dxa" w:w="2880"/>
+          </w:tcPr>
+          <w:p>
+            <w:r>
+              <w:rPr>
+                <w:b/>
+              </w:rPr>
+              <w:t>Статус</w:t>
+            </w:r>
+          </w:p>
+        </w:tc>
+      </w:tr>
+      <w:tr>
+        <w:tc>
+          <w:tcPr>
+            <w:tcW w:type="dxa" w:w="2880"/>
+          </w:tcPr>
+          <w:p>
+            <w:r>
+              <w:t>1</w:t>
+            </w:r>
+          </w:p>
+        </w:tc>
+        <w:tc>
+          <w:tcPr>
+            <w:tcW w:type="dxa" w:w="2880"/>
+          </w:tcPr>
+          <w:p>
+            <w:r>
+              <w:t>РАГ-документы</w:t>
+            </w:r>
+          </w:p>
+        </w:tc>
+        <w:tc>
+          <w:tcPr>
+            <w:tcW w:type="dxa" w:w="2880"/>
+          </w:tcPr>
+          <w:p>
+            <w:r>
+              <w:t>Порядок подтверждён заказчиком; точное содержание волны требует уточнения — см. ниже</w:t>
+            </w:r>
+          </w:p>
+        </w:tc>
+      </w:tr>
+      <w:tr>
+        <w:tc>
+          <w:tcPr>
+            <w:tcW w:type="dxa" w:w="2880"/>
+          </w:tcPr>
+          <w:p>
+            <w:r>
+              <w:t>2</w:t>
+            </w:r>
+          </w:p>
+        </w:tc>
+        <w:tc>
+          <w:tcPr>
+            <w:tcW w:type="dxa" w:w="2880"/>
+          </w:tcPr>
+          <w:p>
+            <w:r>
+              <w:t>Расширение КХД и ESB (шины)</w:t>
+            </w:r>
+          </w:p>
+        </w:tc>
+        <w:tc>
+          <w:tcPr>
+            <w:tcW w:type="dxa" w:w="2880"/>
+          </w:tcPr>
+          <w:p>
+            <w:r>
+              <w:t>Подтверждено заказчиком (см. §2) — больше витрин и API в шине, возможно расширение периметра КХД</w:t>
+            </w:r>
+          </w:p>
+        </w:tc>
+      </w:tr>
+      <w:tr>
+        <w:tc>
+          <w:tcPr>
+            <w:tcW w:type="dxa" w:w="2880"/>
+          </w:tcPr>
+          <w:p>
+            <w:r>
+              <w:t>3+</w:t>
+            </w:r>
+          </w:p>
+        </w:tc>
+        <w:tc>
+          <w:tcPr>
+            <w:tcW w:type="dxa" w:w="2880"/>
+          </w:tcPr>
+          <w:p>
+            <w:r>
+              <w:t>Не определено</w:t>
+            </w:r>
+          </w:p>
+        </w:tc>
+        <w:tc>
+          <w:tcPr>
+            <w:tcW w:type="dxa" w:w="2880"/>
+          </w:tcPr>
+          <w:p>
+            <w:r>
+              <w:t>Заказчик прямо отметил: «уточнить какие дальше»</w:t>
+            </w:r>
+          </w:p>
+        </w:tc>
+      </w:tr>
+    </w:tbl>
+    <w:p>
+      <w:pPr>
+        <w:pStyle w:val="Heading3"/>
+      </w:pPr>
+      <w:r>
+        <w:t>Волна 1 — «РАГ-документы»: что нужно уточнить</w:t>
+      </w:r>
+    </w:p>
+    <w:p>
+      <w:r>
+        <w:t>Формулировка допускает минимум три разных толкования — их не стоит смешивать без явного уточнения у заказчика:</w:t>
+      </w:r>
+    </w:p>
+    <w:p>
+      <w:r>
+        <w:t xml:space="preserve">- </w:t>
+      </w:r>
+      <w:r>
+        <w:rPr>
+          <w:b/>
+        </w:rPr>
+        <w:t>(а) Расширение самого документного корпуса</w:t>
+      </w:r>
+      <w:r>
+        <w:t xml:space="preserve"> — добавление типов документов, не входивших в пилот: Word/PDF из мастер-ТЗ (декларации, договоры ДУ, меморандумы, внутренние регламенты — §1.2, статус «не подтверждено»). Если это имелось в виду — волна 1 частично закрывает вопрос 9 ниже (Word/PDF-регламенты).</w:t>
+      </w:r>
+    </w:p>
+    <w:p>
+      <w:r>
+        <w:t xml:space="preserve">- </w:t>
+      </w:r>
+      <w:r>
+        <w:rPr>
+          <w:b/>
+        </w:rPr>
+        <w:t>(б) Улучшение качества и покрытия уже подключённых RAG-коллекций пилота</w:t>
+      </w:r>
+      <w:r>
+        <w:t xml:space="preserve"> (их 2) — без добавления новых типов документов, а работа над полнотой/актуальностью того, что уже загружено.</w:t>
+      </w:r>
+    </w:p>
+    <w:p>
+      <w:r>
+        <w:t xml:space="preserve">- </w:t>
+      </w:r>
+      <w:r>
+        <w:rPr>
+          <w:b/>
+        </w:rPr>
+        <w:t>(в) Технически новая RAG-коллекция</w:t>
+      </w:r>
+      <w:r>
+        <w:t xml:space="preserve"> под конкретное подразделение или задачу, отдельная от двух пилотных.</w:t>
+      </w:r>
+    </w:p>
+    <w:p>
+      <w:r>
+        <w:t>Рекомендуем закрыть это тем же способом, что и вопрос про «RAG-компании» — коротким уточняющим созвоном, а не перепиской, поскольку от ответа зависит, входит ли волна 1 в периметр методического этапа П2 (архитектура) или это отдельная, более узкая задача каталогизации/загрузки контента.</w:t>
+      </w:r>
+    </w:p>
+    <w:p>
+      <w:pPr>
+        <w:pStyle w:val="Heading3"/>
+      </w:pPr>
+      <w:r>
+        <w:t>Волна 2 — Расширение КХД и ESB</w:t>
+      </w:r>
+    </w:p>
+    <w:p>
+      <w:r>
+        <w:t>Содержание уже описано в §2. Технические открытые вопросы по этой волне — вопросы 1–3 в §5.</w:t>
+      </w:r>
+    </w:p>
+    <w:p>
+      <w:pPr>
+        <w:pStyle w:val="Heading3"/>
+      </w:pPr>
+      <w:r>
+        <w:t>Волна 3+ — открыто, кандидаты для обсуждения</w:t>
+      </w:r>
+    </w:p>
+    <w:p>
+      <w:r>
+        <w:t>Заказчик явно оставил это открытым. Ниже — не решение, а материал для следующего разговора (кандидаты, исходя из известного контекста):</w:t>
+      </w:r>
+    </w:p>
+    <w:p>
+      <w:r>
+        <w:t>- Роллаут на новые роли/подразделения (аналитики/портфельные управляющие → руководство → бэк-офис) — см. предложение 5 в §6.</w:t>
+      </w:r>
+    </w:p>
+    <w:p>
+      <w:r>
+        <w:t>- Переход на динамические права доступа (вопрос 6), если к этому моменту готова платформенная сторона (реестр §4).</w:t>
+      </w:r>
+    </w:p>
+    <w:p>
+      <w:r>
+        <w:t>- Источники вне пилотной тройки (Email/Confluence/Excel-CSV) — если по вопросу 9 заказчик подтвердит их актуальность.</w:t>
+      </w:r>
+    </w:p>
+    <w:p>
+      <w:r>
+        <w:t>- Промышленная эксплуатация (фаза П4 методики) — начинается не как отдельная волна, а как переход в режим SLA после того, как первые волны приняты.</w:t>
+      </w:r>
+    </w:p>
+    <w:p>
+      <w:r>
+        <w:t>---</w:t>
+      </w:r>
+    </w:p>
+    <w:p>
+      <w:pPr>
+        <w:pStyle w:val="Heading2"/>
+      </w:pPr>
+      <w:r>
+        <w:t>4. Реестр открытых платформенных пунктов (скриншот трекера, эта сессия)</w:t>
       </w:r>
     </w:p>
     <w:p>
@@ -962,10 +1270,10 @@
         <w:rPr>
           <w:b/>
         </w:rPr>
-        <w:t>Прямая связь с решением по ESB (§2):</w:t>
+        <w:t>Прямая связь с волной 2 (§3) / решением по ESB (§2):</w:t>
       </w:r>
       <w:r>
-        <w:t xml:space="preserve"> пункты «Обновление данных в RAG-ах через API» (высокий) и «Обновление информации о правах доступа... через таблицы/API» (высокий) — это ровно то, что нужно для расширения витрин/API в шине; без них расширение ESB даёт больше данных, но не даёт актуальности и динамических прав доступа. Это, вероятно, узкое место проекта Д8, а не только общий пункт бэклога платформы.</w:t>
+        <w:t xml:space="preserve"> пункты «Обновление данных в RAG-ах через API» (высокий) и «Обновление информации о правах доступа... через таблицы/API» (высокий) — это ровно то, что нужно для расширения витрин/API в шине; без них расширение ESB даёт больше данных, но не даёт актуальности и динамических прав доступа. Это, вероятно, узкое место волны 2, а не только общий пункт бэклога платформы.</w:t>
       </w:r>
     </w:p>
     <w:p>
@@ -978,7 +1286,7 @@
         <w:pStyle w:val="Heading2"/>
       </w:pPr>
       <w:r>
-        <w:t>4. Список вопросов к заказчику (Д8)</w:t>
+        <w:t>5. Список вопросов к заказчику (Д8)</w:t>
       </w:r>
     </w:p>
     <w:p>
@@ -986,27 +1294,40 @@
         <w:pStyle w:val="Heading3"/>
       </w:pPr>
       <w:r>
-        <w:t>Интеграция (ESB / КХД)</w:t>
+        <w:t>Волны проекта</w:t>
       </w:r>
     </w:p>
     <w:p>
       <w:r>
-        <w:t>1. Какие конкретно витрины данных нужно добавить в ESB сверх текущего среза CRM (Bitrix24)? Список витрин с владельцами на стороне Д8.</w:t>
+        <w:t>1. Волна 1 «РАГ-документы» — что именно имеется в виду: (а) новые типы документов сверх пилотных двух коллекций, (б) улучшение качества/покрытия уже загруженного, или (в) отдельная новая коллекция под конкретную задачу/подразделение?</w:t>
       </w:r>
     </w:p>
     <w:p>
       <w:r>
-        <w:t>2. Какие конкретно API нужно открыть через шину — по каждому: система-источник, формат (REST/SOAP/др.), кто на стороне Д8 отвечает за контракт API.</w:t>
+        <w:t>2. Волна 3 и далее — есть ли уже примерное направление (роли, новые источники, промышленная эксплуатация), или это открытый вопрос до завершения волны 2?</w:t>
+      </w:r>
+    </w:p>
+    <w:p>
+      <w:pPr>
+        <w:pStyle w:val="Heading3"/>
+      </w:pPr>
+      <w:r>
+        <w:t>Интеграция (ESB / КХД, волна 2)</w:t>
       </w:r>
     </w:p>
     <w:p>
       <w:r>
-        <w:t>3. КХД — расширяется ли состав таблиц/витрин внутри самого хранилища, или его периметр остаётся как в пилоте?</w:t>
+        <w:t>3. Какие конкретно витрины данных нужно добавить в ESB сверх текущего среза CRM (Bitrix24)? Список витрин с владельцами на стороне Д8.</w:t>
       </w:r>
     </w:p>
     <w:p>
       <w:r>
-        <w:t>4. Что такое «RAG-компании» — отдельная существующая RAG-система Д8 (тогда нужна федерация поиска между двумя RAG) или другое название того же пилотного контура? (Открытый вопрос ещё с пилотного ТЗ, не закрыт.)</w:t>
+        <w:t>4. Какие конкретно API нужно открыть через шину — по каждому: система-источник, формат (REST/SOAP/др.), кто на стороне Д8 отвечает за контракт API.</w:t>
+      </w:r>
+    </w:p>
+    <w:p>
+      <w:r>
+        <w:t>5. КХД — расширяется ли состав таблиц/витрин внутри самого хранилища, или его периметр остаётся как в пилоте?</w:t>
       </w:r>
     </w:p>
     <w:p>
@@ -1019,22 +1340,22 @@
     </w:p>
     <w:p>
       <w:r>
-        <w:t>5. Реальная оргструктура для проекта: список подразделений/ролей с числом пользователей в каждой (не гипотетическая таблица из мастер-ТЗ, а факт) — нужна для фазы П2 (карта волн роллаута).</w:t>
+        <w:t>6. Реальная оргструктура для проекта: список подразделений/ролей с числом пользователей в каждой (не гипотетическая таблица из мастер-ТЗ, а факт) — нужна для карты волн 3+.</w:t>
       </w:r>
     </w:p>
     <w:p>
       <w:r>
-        <w:t>6. Разграничение прав «compliance видит своё, менеджер — своих клиентов» (п. 3.2 мастер-ТЗ, помечено «опционально в v2») — обязательное требование для проекта или можно оставить на будущее?</w:t>
+        <w:t>7. Разграничение прав «compliance видит своё, менеджер — своих клиентов» (п. 3.2 мастер-ТЗ, помечено «опционально в v2») — обязательное требование для проекта или можно оставить на будущее?</w:t>
       </w:r>
     </w:p>
     <w:p>
       <w:r>
-        <w:t>7. Права доступа сотрудников сейчас фиксированы по статичному списку политик. Для проекта это должно стать динамическим (через таблицы/API из системы-источника прав)? Если да — какая система является источником истины по правам (HR-система, Bitrix24, отдельный IAM)?</w:t>
+        <w:t>8. Права доступа сотрудников сейчас фиксированы по статичному списку политик. Для проекта это должно стать динамическим (через таблицы/API из системы-источника прав)? Если да — какая система является источником истины по правам (HR-система, Bitrix24, отдельный IAM)?</w:t>
       </w:r>
     </w:p>
     <w:p>
       <w:r>
-        <w:t>8. Нужна ли мультидоменная авторизация (из реестра платформы, критичный приоритет) — сколько доменов/поддоменов у Д8 предполагается подключить?</w:t>
+        <w:t>9. Нужна ли мультидоменная авторизация (из реестра платформы, критичный приоритет) — сколько доменов/поддоменов у Д8 предполагается подключить?</w:t>
       </w:r>
     </w:p>
     <w:p>
@@ -1042,17 +1363,17 @@
         <w:pStyle w:val="Heading3"/>
       </w:pPr>
       <w:r>
-        <w:t>Источники данных вне пилотных четырёх</w:t>
+        <w:t>Источники данных вне пилотных трёх</w:t>
       </w:r>
     </w:p>
     <w:p>
       <w:r>
-        <w:t>9. Email, Word/PDF-регламенты, Confluence из мастер-ТЗ (§1.2) — они не входили в пилот и не затронуты решением расширять ESB/КХД. Подтверждается ли, что они НЕ входят и в проект, или это отдельный вопрос, который ещё предстоит решить?</w:t>
+        <w:t>10. Email, Word/PDF-регламенты, Confluence из мастер-ТЗ (§1.2) — они не входили в пилот. Подтверждается ли, что они НЕ входят и в проект (за вычетом того, что может решиться толкованием волны 1(а)), или это отдельный вопрос, который ещё предстоит решить?</w:t>
       </w:r>
     </w:p>
     <w:p>
       <w:r>
-        <w:t>10. Email в мастер-ТЗ помечен Must Have, но тест-кейсы (TC-EMAIL) отсутствовали уже в пилоте — снимается ли это требование в проекте или переносится?</w:t>
+        <w:t>11. Email в мастер-ТЗ помечен Must Have, но тест-кейсы (TC-EMAIL) отсутствовали уже в пилоте — снимается ли это требование в проекте или переносится?</w:t>
       </w:r>
     </w:p>
     <w:p>
@@ -1060,27 +1381,27 @@
         <w:pStyle w:val="Heading3"/>
       </w:pPr>
       <w:r>
-        <w:t>Платформенные возможности (из реестра §3)</w:t>
+        <w:t>Платформенные возможности (из реестра §4)</w:t>
       </w:r>
     </w:p>
     <w:p>
       <w:r>
-        <w:t>11. Актуализация RAG-баз через API (высокий приоритет в реестре) — это блокер для проекта Д8 или можно стартовать с ручным/пакетным обновлением на первых волнах?</w:t>
+        <w:t>12. Актуализация RAG-баз через API (высокий приоритет в реестре) — это блокер для волны 2 или можно стартовать с ручным/пакетным обновлением?</w:t>
       </w:r>
     </w:p>
     <w:p>
       <w:r>
-        <w:t>12. Персональные RAG-коллекции пользователей — нужны ли для проекта Д8, или это общий продуктовый пункт не по конкретному запросу заказчика?</w:t>
+        <w:t>13. Персональные RAG-коллекции пользователей — нужны ли для проекта Д8, или это общий продуктовый пункт не по конкретному запросу заказчика?</w:t>
       </w:r>
     </w:p>
     <w:p>
       <w:r>
-        <w:t>13. Работа с MS Office 365 — есть ли у Д8 контур O365 (SharePoint/Outlook/Teams), который нужно подключать, или пункт не относится к этому проекту?</w:t>
+        <w:t>14. Работа с MS Office 365 — есть ли у Д8 контур O365 (SharePoint/Outlook/Teams), который нужно подключать, или пункт не относится к этому проекту?</w:t>
       </w:r>
     </w:p>
     <w:p>
       <w:r>
-        <w:t>14. Поддержка актуальной версии API внешней модели (web search и т.п.) — есть ли у Д8 конкретный сценарий использования веб-поиска, который сейчас блокирован?</w:t>
+        <w:t>15. Поддержка актуальной версии API внешней модели (web search и т.п.) — есть ли у Д8 конкретный сценарий использования веб-поиска, который сейчас блокирован?</w:t>
       </w:r>
     </w:p>
     <w:p>
@@ -1093,12 +1414,7 @@
     </w:p>
     <w:p>
       <w:r>
-        <w:t>15. Кто со стороны Д8 — новый владелец процесса на фазе П4 (промышленная эксплуатация)? Тот же технический контакт, что в пилоте, или отдельная выделенная роль/команда?</w:t>
-      </w:r>
-    </w:p>
-    <w:p>
-      <w:r>
-        <w:t>16. Есть ли у Д8 предпочтение по разбивке на волны (по подразделениям, по типам источников, по группам пользователей) — или карту волн предлагаем мы (фаза П2)?</w:t>
+        <w:t>16. Кто со стороны Д8 — новый владелец процесса на фазе П4 (промышленная эксплуатация)? Тот же технический контакт, что в пилоте, или отдельная выделенная роль/команда?</w:t>
       </w:r>
     </w:p>
     <w:p>
@@ -1126,7 +1442,7 @@
         <w:pStyle w:val="Heading2"/>
       </w:pPr>
       <w:r>
-        <w:t>5. Наши предложения (не только вопросы — рабочая позиция по умолчанию)</w:t>
+        <w:t>6. Наши предложения (не только вопросы — рабочая позиция по умолчанию)</w:t>
       </w:r>
     </w:p>
     <w:p>
@@ -1142,10 +1458,10 @@
         <w:rPr>
           <w:b/>
         </w:rPr>
-        <w:t>Решение по ESB/КХД зафиксировать письменно как есть — расширение, не сужение.</w:t>
+        <w:t>Волна 1 — закрыть коротким созвоном, не перепиской.</w:t>
       </w:r>
       <w:r>
-        <w:t xml:space="preserve"> Предлагаем формулировку для проектного ТЗ: «Все 4 пилотных источника (КХД, ESB/CRM, MCP-сервер, «RAG-компании») остаются в проекте; ESB и КХД получают расширение (витрины/API), MCP-сервер и «RAG-компании» — на пилотном уровне». Источники вне пилотной четвёрки (Email, Word/PDF-регламенты, Confluence, прямой Excel/CSV) — отдельный, пока не решённый вопрос (см. вопрос 9), не путать с этим решением.</w:t>
+        <w:t xml:space="preserve"> Как и с «RAG-компании» — три возможных толкования (§3) слишком разные по объёму работ, чтобы гадать. Предлагаем этот вопрос первым, до отправки остального списка.</w:t>
       </w:r>
     </w:p>
     <w:p>
@@ -1156,10 +1472,10 @@
         <w:rPr>
           <w:b/>
         </w:rPr>
-        <w:t>«RAG-компании» — не вопрос в списке, а звонок на 30 минут до начала фазы П1.</w:t>
+        <w:t>Решение по ESB/КХД (волна 2) зафиксировать письменно как есть — расширение, не сужение.</w:t>
       </w:r>
       <w:r>
-        <w:t xml:space="preserve"> Слишком развилочный пункт (federated-поиск между двумя RAG-системами — это другая архитектура, чем опечатка в названии), чтобы решать перепиской. Предлагаем закрыть это первым, до отправки остальных вопросов.</w:t>
+        <w:t xml:space="preserve"> Предлагаем формулировку для проектного ТЗ: «Все 3 пилотных источника (КХД, ESB/CRM, MCP-сервер) остаются в проекте; ESB и КХД получают расширение (витрины/API), MCP-сервер — на пилотном уровне; «RAG-компании» исключён из скоупа как опечатка/дублирующее название». Источники вне пилотной тройки — отдельный, пока не решённый вопрос (вопрос 10), не путать с этим решением.</w:t>
       </w:r>
     </w:p>
     <w:p>
@@ -1173,7 +1489,7 @@
         <w:t>Разграничение прав compliance/менеджер — предлагаем переквалифицировать из «опционально в v2» в обязательное для проекта.</w:t>
       </w:r>
       <w:r>
-        <w:t xml:space="preserve"> Мастер-ТЗ пометил это как опциональное, но Д8 — брокер/инвестиционная компания, и доступ менеджера к чужим клиентам — это не UX-неудобство, а комплаенс-риск. Рекомендуем не спрашивать «нужно ли», а прямо предложить включить в обязательный скоуп П1 и попросить заказчика подтвердить/отклонить, а не решать с нуля.</w:t>
+        <w:t xml:space="preserve"> Мастер-ТЗ пометил это как опциональное, но Д8 — брокер/инвестиционная компания, и доступ менеджера к чужим клиентам — это не UX-неудобство, а комплаенс-риск. Рекомендуем не спрашивать «нужно ли», а прямо предложить включить в обязательный скоуп и попросить заказчика подтвердить/отклонить, а не решать с нуля.</w:t>
       </w:r>
     </w:p>
     <w:p>
@@ -1184,10 +1500,10 @@
         <w:rPr>
           <w:b/>
         </w:rPr>
-        <w:t>Динамические права доступа и обновление RAG через API — не блокировать старт проекта, но зафиксировать как gate для поздних волн.</w:t>
+        <w:t>Динамические права доступа и обновление RAG через API — не блокировать волну 2, но зафиксировать как gate для поздних волн.</w:t>
       </w:r>
       <w:r>
-        <w:t xml:space="preserve"> Оба пункта сейчас в статусе «требует проработки» и на стороне платформы (реестр §3), то есть ждать их полной готовности перед стартом П1 нецелесообразно. Предлагаем: первые 1–2 волны запускать на статичной модели прав (как в пилоте), но заложить в архитектуру П2 совместимость с будущим переходом на API-модель — и явно зафиксировать, что волны с данными повышенной чувствительности (comлаенс, бэк-офис) не начинаются, пока оба пункта не готовы.</w:t>
+        <w:t xml:space="preserve"> Оба пункта сейчас в статусе «требует проработки» на стороне платформы (реестр §4), то есть ждать их полной готовности перед стартом волны 2 нецелесообразно. Предлагаем: волну 2 запускать на статичной модели прав (как в пилоте), но заложить в архитектуру совместимость с будущим переходом на API-модель — и явно зафиксировать, что волны с данными повышенной чувствительности (комплаенс, бэк-офис, кандидаты для волны 3+) не начинаются, пока оба пункта не готовы.</w:t>
       </w:r>
     </w:p>
     <w:p>
@@ -1201,7 +1517,7 @@
         <w:t>Мультидоменная авторизация (критичный приоритет в реестре платформы) — предлагаем сначала оспорить применимость, а не сразу проектировать под неё.</w:t>
       </w:r>
       <w:r>
-        <w:t xml:space="preserve"> Ни в одном документе базы нет признаков того, что Д8 — холдинг с несколькими доменами; известная оргструктура — одна компания. Прежде чем закладывать эту возможность в скоуп проекта, стоит явно спросить у заказчика, актуальна ли она для Д8 конкретно, или это общий продуктовый пункт вендора не по адресу.</w:t>
+        <w:t xml:space="preserve"> Ни в одном документе базы нет признаков того, что Д8 — холдинг с несколькими доменами; известная оргструктура — одна компания. Прежде чем закладывать эту возможность в скоуп проекта, стоит явно спросить у заказчика, актуальна ли она для Д8 конкретно.</w:t>
       </w:r>
     </w:p>
     <w:p>
@@ -1212,10 +1528,10 @@
         <w:rPr>
           <w:b/>
         </w:rPr>
-        <w:t>Порядок волн (к вопросу 16) — предлагаем по умолчанию: фронт-офис → аналитики/портфельные управляющие → руководство → бэк-офис.</w:t>
+        <w:t>Для волны 3+, если это роллаут по ролям — предлагаем порядок по умолчанию: фронт-офис → аналитики/портфельные управляющие → руководство → бэк-офис.</w:t>
       </w:r>
       <w:r>
-        <w:t xml:space="preserve"> Обоснование: фронт-офис — единственная роль, реально протестированная в пилоте (тот же кейс D8-014), значит первая волна — наименьший технический риск и самый быстрый цикл по методике (переиспользование готовых сценариев). Бэк-офис — последним, поскольку это самые чувствительные данные (сделки, документы) и именно туда упирается вопрос 4 выше (права доступа).</w:t>
+        <w:t xml:space="preserve"> Обоснование: фронт-офис — единственная роль, реально протестированная в пилоте (тот же кейс D8-014), значит первая среди ролевых волн — наименьший технический риск. Бэк-офис — последним: самые чувствительные данные (сделки, документы), и именно туда упирается вопрос 8 (динамические права доступа).</w:t>
       </w:r>
     </w:p>
     <w:p>
@@ -1226,10 +1542,10 @@
         <w:rPr>
           <w:b/>
         </w:rPr>
-        <w:t>Критерий перехода (к вопросу 17) — предлагаем не ждать дозакрытия сценариев 6 и 4.</w:t>
+        <w:t>Критерий перехода (вопрос 17) — предлагаем не ждать дозакрытия сценариев 6 и 4.</w:t>
       </w:r>
       <w:r>
-        <w:t xml:space="preserve"> По методике (§4.1 Кейса 2) переход не требует 100% pass. Предлагаем перенести оба открытых пункта в явный «список долга» бизнес-кейса П1 — с обязательством закрыть их в рамках первой волны, а не тихо забыть при переходе в проект.</w:t>
+        <w:t xml:space="preserve"> По методике (§4.1 Кейса 2) переход не требует 100% pass. Предлагаем перенести оба открытых пункта в явный «список долга» бизнес-кейса П1 — с обязательством закрыть их в рамках волны 1 или 2, а не тихо забыть при переходе в проект.</w:t>
       </w:r>
     </w:p>
     <w:p>
@@ -1240,10 +1556,10 @@
         <w:rPr>
           <w:b/>
         </w:rPr>
-        <w:t>Реестр платформенных пунктов (§3) — предлагаем выделить в отдельный трек переговоров с вендором, не смешивать с вопросами к заказчику.</w:t>
+        <w:t>Реестр платформенных пунктов (§4) — предлагаем выделить в отдельный трек переговоров с вендором, не смешивать с вопросами к заказчику.</w:t>
       </w:r>
       <w:r>
-        <w:t xml:space="preserve"> «Обновление данных в RAG через API» и «динамические права доступа» (оба — высокий приоритет) — это зависимости проекта Д8 от роадмапа вендора, а не то, что решает сам заказчик. Рекомендуем формализовать как два конкретных технических запроса вендору со сроками, по аналогии с </w:t>
+        <w:t xml:space="preserve"> «Обновление данных в RAG через API» и «динамические права доступа» — это зависимости волны 2 от роадмапа вендора, а не то, что решает сам заказчик. Рекомендуем формализовать как два конкретных технических запроса вендору со сроками, по аналогии с </w:t>
       </w:r>
       <w:r>
         <w:rPr>
@@ -1253,7 +1569,7 @@
         <w:t>case-11-voprosy-vendoru-roadmap.md</w:t>
       </w:r>
       <w:r>
-        <w:t>, а не оставлять как общий пункт бэклога.</w:t>
+        <w:t>.</w:t>
       </w:r>
     </w:p>
     <w:p>

</xml_diff>

<commit_message>
Add quarter/clarification columns to registry, trim customer questions to only "Уточнить у заказчика" items
Registry table (§4) now carries Квартал and Уточнение columns from the updated screenshot. Rewrote §5's platform-capability questions to include only the 4 items actually marked "Уточнить у заказчика" (source toggling, dynamic access rights, personal RAG collections, user-provisioning simplification) -- dropped multi-domain auth, MS Office 365, RAG-update-via-API and search-API-support questions since those are either already scheduled for Q4 or being resolved internally ("Уточняем"), not customer-facing. Updated §6 proposals to match (dropped the standalone multi-domain-auth challenge and the vendor-negotiation-track proposal, folded their substance into revised proposal 4). Renumbered questions 1-15 and fixed all cross-references.

Co-Authored-By: Claude Sonnet 5 <noreply@anthropic.com>
Claude-Session: https://claude.ai/code/session_01DpSN8JwCJ3tg3JVUadr2zE
</commit_message>
<xml_diff>
--- a/docs/analysis/case-27-proekt-d8-skoup-i-voprosy.docx
+++ b/docs/analysis/case-27-proekt-d8-skoup-i-voprosy.docx
@@ -857,7 +857,7 @@
     </w:p>
     <w:p>
       <w:r>
-        <w:t>Транскрипция таблицы, присланной пользователем — статус/приоритет платформенных возможностей, релевантных для оценки готовности к проекту Д8:</w:t>
+        <w:t>Транскрипция таблицы, присланной пользователем — статус/приоритет платформенных возможностей, релевантных для оценки готовности к проекту Д8. Дополнена (14.09.2026) колонками «Квартал» (срок на стороне платформы) и «Уточнение» (что уже помечено как требующее уточнения у заказчика):</w:t>
       </w:r>
     </w:p>
     <w:tbl>
@@ -867,14 +867,16 @@
         <w:tblLook w:firstColumn="1" w:firstRow="1" w:lastColumn="0" w:lastRow="0" w:noHBand="0" w:noVBand="1" w:val="04A0"/>
       </w:tblPr>
       <w:tblGrid>
-        <w:gridCol w:w="2880"/>
-        <w:gridCol w:w="2880"/>
-        <w:gridCol w:w="2880"/>
+        <w:gridCol w:w="1728"/>
+        <w:gridCol w:w="1728"/>
+        <w:gridCol w:w="1728"/>
+        <w:gridCol w:w="1728"/>
+        <w:gridCol w:w="1728"/>
       </w:tblGrid>
       <w:tr>
         <w:tc>
           <w:tcPr>
-            <w:tcW w:type="dxa" w:w="2880"/>
+            <w:tcW w:type="dxa" w:w="1728"/>
           </w:tcPr>
           <w:p>
             <w:r>
@@ -887,7 +889,7 @@
         </w:tc>
         <w:tc>
           <w:tcPr>
-            <w:tcW w:type="dxa" w:w="2880"/>
+            <w:tcW w:type="dxa" w:w="1728"/>
           </w:tcPr>
           <w:p>
             <w:r>
@@ -900,7 +902,7 @@
         </w:tc>
         <w:tc>
           <w:tcPr>
-            <w:tcW w:type="dxa" w:w="2880"/>
+            <w:tcW w:type="dxa" w:w="1728"/>
           </w:tcPr>
           <w:p>
             <w:r>
@@ -911,11 +913,37 @@
             </w:r>
           </w:p>
         </w:tc>
+        <w:tc>
+          <w:tcPr>
+            <w:tcW w:type="dxa" w:w="1728"/>
+          </w:tcPr>
+          <w:p>
+            <w:r>
+              <w:rPr>
+                <w:b/>
+              </w:rPr>
+              <w:t>Квартал</w:t>
+            </w:r>
+          </w:p>
+        </w:tc>
+        <w:tc>
+          <w:tcPr>
+            <w:tcW w:type="dxa" w:w="1728"/>
+          </w:tcPr>
+          <w:p>
+            <w:r>
+              <w:rPr>
+                <w:b/>
+              </w:rPr>
+              <w:t>Уточнение</w:t>
+            </w:r>
+          </w:p>
+        </w:tc>
       </w:tr>
       <w:tr>
         <w:tc>
           <w:tcPr>
-            <w:tcW w:type="dxa" w:w="2880"/>
+            <w:tcW w:type="dxa" w:w="1728"/>
           </w:tcPr>
           <w:p>
             <w:r>
@@ -925,7 +953,7 @@
         </w:tc>
         <w:tc>
           <w:tcPr>
-            <w:tcW w:type="dxa" w:w="2880"/>
+            <w:tcW w:type="dxa" w:w="1728"/>
           </w:tcPr>
           <w:p>
             <w:r>
@@ -935,7 +963,7 @@
         </w:tc>
         <w:tc>
           <w:tcPr>
-            <w:tcW w:type="dxa" w:w="2880"/>
+            <w:tcW w:type="dxa" w:w="1728"/>
           </w:tcPr>
           <w:p>
             <w:r>
@@ -943,11 +971,31 @@
             </w:r>
           </w:p>
         </w:tc>
+        <w:tc>
+          <w:tcPr>
+            <w:tcW w:type="dxa" w:w="1728"/>
+          </w:tcPr>
+          <w:p>
+            <w:r>
+              <w:t>4 квартал</w:t>
+            </w:r>
+          </w:p>
+        </w:tc>
+        <w:tc>
+          <w:tcPr>
+            <w:tcW w:type="dxa" w:w="1728"/>
+          </w:tcPr>
+          <w:p>
+            <w:r>
+              <w:t>—</w:t>
+            </w:r>
+          </w:p>
+        </w:tc>
       </w:tr>
       <w:tr>
         <w:tc>
           <w:tcPr>
-            <w:tcW w:type="dxa" w:w="2880"/>
+            <w:tcW w:type="dxa" w:w="1728"/>
           </w:tcPr>
           <w:p>
             <w:r>
@@ -957,7 +1005,7 @@
         </w:tc>
         <w:tc>
           <w:tcPr>
-            <w:tcW w:type="dxa" w:w="2880"/>
+            <w:tcW w:type="dxa" w:w="1728"/>
           </w:tcPr>
           <w:p>
             <w:r>
@@ -967,7 +1015,7 @@
         </w:tc>
         <w:tc>
           <w:tcPr>
-            <w:tcW w:type="dxa" w:w="2880"/>
+            <w:tcW w:type="dxa" w:w="1728"/>
           </w:tcPr>
           <w:p>
             <w:r>
@@ -975,11 +1023,31 @@
             </w:r>
           </w:p>
         </w:tc>
+        <w:tc>
+          <w:tcPr>
+            <w:tcW w:type="dxa" w:w="1728"/>
+          </w:tcPr>
+          <w:p>
+            <w:r>
+              <w:t>4 квартал</w:t>
+            </w:r>
+          </w:p>
+        </w:tc>
+        <w:tc>
+          <w:tcPr>
+            <w:tcW w:type="dxa" w:w="1728"/>
+          </w:tcPr>
+          <w:p>
+            <w:r>
+              <w:t>—</w:t>
+            </w:r>
+          </w:p>
+        </w:tc>
       </w:tr>
       <w:tr>
         <w:tc>
           <w:tcPr>
-            <w:tcW w:type="dxa" w:w="2880"/>
+            <w:tcW w:type="dxa" w:w="1728"/>
           </w:tcPr>
           <w:p>
             <w:r>
@@ -989,7 +1057,7 @@
         </w:tc>
         <w:tc>
           <w:tcPr>
-            <w:tcW w:type="dxa" w:w="2880"/>
+            <w:tcW w:type="dxa" w:w="1728"/>
           </w:tcPr>
           <w:p>
             <w:r>
@@ -999,7 +1067,7 @@
         </w:tc>
         <w:tc>
           <w:tcPr>
-            <w:tcW w:type="dxa" w:w="2880"/>
+            <w:tcW w:type="dxa" w:w="1728"/>
           </w:tcPr>
           <w:p>
             <w:r>
@@ -1007,11 +1075,31 @@
             </w:r>
           </w:p>
         </w:tc>
+        <w:tc>
+          <w:tcPr>
+            <w:tcW w:type="dxa" w:w="1728"/>
+          </w:tcPr>
+          <w:p>
+            <w:r>
+              <w:t>—</w:t>
+            </w:r>
+          </w:p>
+        </w:tc>
+        <w:tc>
+          <w:tcPr>
+            <w:tcW w:type="dxa" w:w="1728"/>
+          </w:tcPr>
+          <w:p>
+            <w:r>
+              <w:t>Уточняем (на стороне платформы)</w:t>
+            </w:r>
+          </w:p>
+        </w:tc>
       </w:tr>
       <w:tr>
         <w:tc>
           <w:tcPr>
-            <w:tcW w:type="dxa" w:w="2880"/>
+            <w:tcW w:type="dxa" w:w="1728"/>
           </w:tcPr>
           <w:p>
             <w:r>
@@ -1021,7 +1109,7 @@
         </w:tc>
         <w:tc>
           <w:tcPr>
-            <w:tcW w:type="dxa" w:w="2880"/>
+            <w:tcW w:type="dxa" w:w="1728"/>
           </w:tcPr>
           <w:p>
             <w:r>
@@ -1031,7 +1119,7 @@
         </w:tc>
         <w:tc>
           <w:tcPr>
-            <w:tcW w:type="dxa" w:w="2880"/>
+            <w:tcW w:type="dxa" w:w="1728"/>
           </w:tcPr>
           <w:p>
             <w:r>
@@ -1039,11 +1127,9 @@
             </w:r>
           </w:p>
         </w:tc>
-      </w:tr>
-      <w:tr>
         <w:tc>
           <w:tcPr>
-            <w:tcW w:type="dxa" w:w="2880"/>
+            <w:tcW w:type="dxa" w:w="1728"/>
           </w:tcPr>
           <w:p>
             <w:r>
@@ -1053,7 +1139,29 @@
         </w:tc>
         <w:tc>
           <w:tcPr>
-            <w:tcW w:type="dxa" w:w="2880"/>
+            <w:tcW w:type="dxa" w:w="1728"/>
+          </w:tcPr>
+          <w:p>
+            <w:r>
+              <w:t>Уточнить у заказчика</w:t>
+            </w:r>
+          </w:p>
+        </w:tc>
+      </w:tr>
+      <w:tr>
+        <w:tc>
+          <w:tcPr>
+            <w:tcW w:type="dxa" w:w="1728"/>
+          </w:tcPr>
+          <w:p>
+            <w:r>
+              <w:t>—</w:t>
+            </w:r>
+          </w:p>
+        </w:tc>
+        <w:tc>
+          <w:tcPr>
+            <w:tcW w:type="dxa" w:w="1728"/>
           </w:tcPr>
           <w:p>
             <w:r>
@@ -1063,7 +1171,7 @@
         </w:tc>
         <w:tc>
           <w:tcPr>
-            <w:tcW w:type="dxa" w:w="2880"/>
+            <w:tcW w:type="dxa" w:w="1728"/>
           </w:tcPr>
           <w:p>
             <w:r>
@@ -1071,11 +1179,31 @@
             </w:r>
           </w:p>
         </w:tc>
+        <w:tc>
+          <w:tcPr>
+            <w:tcW w:type="dxa" w:w="1728"/>
+          </w:tcPr>
+          <w:p>
+            <w:r>
+              <w:t>4 квартал</w:t>
+            </w:r>
+          </w:p>
+        </w:tc>
+        <w:tc>
+          <w:tcPr>
+            <w:tcW w:type="dxa" w:w="1728"/>
+          </w:tcPr>
+          <w:p>
+            <w:r>
+              <w:t>—</w:t>
+            </w:r>
+          </w:p>
+        </w:tc>
       </w:tr>
       <w:tr>
         <w:tc>
           <w:tcPr>
-            <w:tcW w:type="dxa" w:w="2880"/>
+            <w:tcW w:type="dxa" w:w="1728"/>
           </w:tcPr>
           <w:p>
             <w:r>
@@ -1085,7 +1213,7 @@
         </w:tc>
         <w:tc>
           <w:tcPr>
-            <w:tcW w:type="dxa" w:w="2880"/>
+            <w:tcW w:type="dxa" w:w="1728"/>
           </w:tcPr>
           <w:p>
             <w:r>
@@ -1095,7 +1223,7 @@
         </w:tc>
         <w:tc>
           <w:tcPr>
-            <w:tcW w:type="dxa" w:w="2880"/>
+            <w:tcW w:type="dxa" w:w="1728"/>
           </w:tcPr>
           <w:p>
             <w:r>
@@ -1103,11 +1231,31 @@
             </w:r>
           </w:p>
         </w:tc>
+        <w:tc>
+          <w:tcPr>
+            <w:tcW w:type="dxa" w:w="1728"/>
+          </w:tcPr>
+          <w:p>
+            <w:r>
+              <w:t>4 квартал</w:t>
+            </w:r>
+          </w:p>
+        </w:tc>
+        <w:tc>
+          <w:tcPr>
+            <w:tcW w:type="dxa" w:w="1728"/>
+          </w:tcPr>
+          <w:p>
+            <w:r>
+              <w:t>—</w:t>
+            </w:r>
+          </w:p>
+        </w:tc>
       </w:tr>
       <w:tr>
         <w:tc>
           <w:tcPr>
-            <w:tcW w:type="dxa" w:w="2880"/>
+            <w:tcW w:type="dxa" w:w="1728"/>
           </w:tcPr>
           <w:p>
             <w:r>
@@ -1117,7 +1265,7 @@
         </w:tc>
         <w:tc>
           <w:tcPr>
-            <w:tcW w:type="dxa" w:w="2880"/>
+            <w:tcW w:type="dxa" w:w="1728"/>
           </w:tcPr>
           <w:p>
             <w:r>
@@ -1127,7 +1275,7 @@
         </w:tc>
         <w:tc>
           <w:tcPr>
-            <w:tcW w:type="dxa" w:w="2880"/>
+            <w:tcW w:type="dxa" w:w="1728"/>
           </w:tcPr>
           <w:p>
             <w:r>
@@ -1135,11 +1283,31 @@
             </w:r>
           </w:p>
         </w:tc>
+        <w:tc>
+          <w:tcPr>
+            <w:tcW w:type="dxa" w:w="1728"/>
+          </w:tcPr>
+          <w:p>
+            <w:r>
+              <w:t>—</w:t>
+            </w:r>
+          </w:p>
+        </w:tc>
+        <w:tc>
+          <w:tcPr>
+            <w:tcW w:type="dxa" w:w="1728"/>
+          </w:tcPr>
+          <w:p>
+            <w:r>
+              <w:t>Уточнить у заказчика</w:t>
+            </w:r>
+          </w:p>
+        </w:tc>
       </w:tr>
       <w:tr>
         <w:tc>
           <w:tcPr>
-            <w:tcW w:type="dxa" w:w="2880"/>
+            <w:tcW w:type="dxa" w:w="1728"/>
           </w:tcPr>
           <w:p>
             <w:r>
@@ -1149,7 +1317,7 @@
         </w:tc>
         <w:tc>
           <w:tcPr>
-            <w:tcW w:type="dxa" w:w="2880"/>
+            <w:tcW w:type="dxa" w:w="1728"/>
           </w:tcPr>
           <w:p>
             <w:r>
@@ -1159,7 +1327,7 @@
         </w:tc>
         <w:tc>
           <w:tcPr>
-            <w:tcW w:type="dxa" w:w="2880"/>
+            <w:tcW w:type="dxa" w:w="1728"/>
           </w:tcPr>
           <w:p>
             <w:r>
@@ -1167,11 +1335,31 @@
             </w:r>
           </w:p>
         </w:tc>
+        <w:tc>
+          <w:tcPr>
+            <w:tcW w:type="dxa" w:w="1728"/>
+          </w:tcPr>
+          <w:p>
+            <w:r>
+              <w:t>4 квартал — 1 квартал 2027</w:t>
+            </w:r>
+          </w:p>
+        </w:tc>
+        <w:tc>
+          <w:tcPr>
+            <w:tcW w:type="dxa" w:w="1728"/>
+          </w:tcPr>
+          <w:p>
+            <w:r>
+              <w:t>—</w:t>
+            </w:r>
+          </w:p>
+        </w:tc>
       </w:tr>
       <w:tr>
         <w:tc>
           <w:tcPr>
-            <w:tcW w:type="dxa" w:w="2880"/>
+            <w:tcW w:type="dxa" w:w="1728"/>
           </w:tcPr>
           <w:p>
             <w:r>
@@ -1181,7 +1369,7 @@
         </w:tc>
         <w:tc>
           <w:tcPr>
-            <w:tcW w:type="dxa" w:w="2880"/>
+            <w:tcW w:type="dxa" w:w="1728"/>
           </w:tcPr>
           <w:p>
             <w:r>
@@ -1191,7 +1379,7 @@
         </w:tc>
         <w:tc>
           <w:tcPr>
-            <w:tcW w:type="dxa" w:w="2880"/>
+            <w:tcW w:type="dxa" w:w="1728"/>
           </w:tcPr>
           <w:p>
             <w:r>
@@ -1199,11 +1387,31 @@
             </w:r>
           </w:p>
         </w:tc>
+        <w:tc>
+          <w:tcPr>
+            <w:tcW w:type="dxa" w:w="1728"/>
+          </w:tcPr>
+          <w:p>
+            <w:r>
+              <w:t>—</w:t>
+            </w:r>
+          </w:p>
+        </w:tc>
+        <w:tc>
+          <w:tcPr>
+            <w:tcW w:type="dxa" w:w="1728"/>
+          </w:tcPr>
+          <w:p>
+            <w:r>
+              <w:t>Уточнить у заказчика</w:t>
+            </w:r>
+          </w:p>
+        </w:tc>
       </w:tr>
       <w:tr>
         <w:tc>
           <w:tcPr>
-            <w:tcW w:type="dxa" w:w="2880"/>
+            <w:tcW w:type="dxa" w:w="1728"/>
           </w:tcPr>
           <w:p>
             <w:r>
@@ -1213,7 +1421,7 @@
         </w:tc>
         <w:tc>
           <w:tcPr>
-            <w:tcW w:type="dxa" w:w="2880"/>
+            <w:tcW w:type="dxa" w:w="1728"/>
           </w:tcPr>
           <w:p>
             <w:r>
@@ -1223,7 +1431,7 @@
         </w:tc>
         <w:tc>
           <w:tcPr>
-            <w:tcW w:type="dxa" w:w="2880"/>
+            <w:tcW w:type="dxa" w:w="1728"/>
           </w:tcPr>
           <w:p>
             <w:r>
@@ -1231,11 +1439,31 @@
             </w:r>
           </w:p>
         </w:tc>
+        <w:tc>
+          <w:tcPr>
+            <w:tcW w:type="dxa" w:w="1728"/>
+          </w:tcPr>
+          <w:p>
+            <w:r>
+              <w:t>4 квартал</w:t>
+            </w:r>
+          </w:p>
+        </w:tc>
+        <w:tc>
+          <w:tcPr>
+            <w:tcW w:type="dxa" w:w="1728"/>
+          </w:tcPr>
+          <w:p>
+            <w:r>
+              <w:t>—</w:t>
+            </w:r>
+          </w:p>
+        </w:tc>
       </w:tr>
       <w:tr>
         <w:tc>
           <w:tcPr>
-            <w:tcW w:type="dxa" w:w="2880"/>
+            <w:tcW w:type="dxa" w:w="1728"/>
           </w:tcPr>
           <w:p>
             <w:r>
@@ -1245,7 +1473,7 @@
         </w:tc>
         <w:tc>
           <w:tcPr>
-            <w:tcW w:type="dxa" w:w="2880"/>
+            <w:tcW w:type="dxa" w:w="1728"/>
           </w:tcPr>
           <w:p>
             <w:r>
@@ -1255,11 +1483,31 @@
         </w:tc>
         <w:tc>
           <w:tcPr>
-            <w:tcW w:type="dxa" w:w="2880"/>
+            <w:tcW w:type="dxa" w:w="1728"/>
           </w:tcPr>
           <w:p>
             <w:r>
               <w:t>Нормальный</w:t>
+            </w:r>
+          </w:p>
+        </w:tc>
+        <w:tc>
+          <w:tcPr>
+            <w:tcW w:type="dxa" w:w="1728"/>
+          </w:tcPr>
+          <w:p>
+            <w:r>
+              <w:t>—</w:t>
+            </w:r>
+          </w:p>
+        </w:tc>
+        <w:tc>
+          <w:tcPr>
+            <w:tcW w:type="dxa" w:w="1728"/>
+          </w:tcPr>
+          <w:p>
+            <w:r>
+              <w:t>Уточнить у заказчика</w:t>
             </w:r>
           </w:p>
         </w:tc>
@@ -1270,10 +1518,37 @@
         <w:rPr>
           <w:b/>
         </w:rPr>
-        <w:t>Прямая связь с волной 2 (§3) / решением по ESB (§2):</w:t>
+        <w:t>Прямая связь с волной 2 (§3) / решением по ESB (§2) — с поправкой на сроки:</w:t>
+      </w:r>
+    </w:p>
+    <w:p>
+      <w:r>
+        <w:t xml:space="preserve">- «Обновление данных в RAG-ах через API» (высокий) — </w:t>
       </w:r>
       <w:r>
-        <w:t xml:space="preserve"> пункты «Обновление данных в RAG-ах через API» (высокий) и «Обновление информации о правах доступа... через таблицы/API» (высокий) — это ровно то, что нужно для расширения витрин/API в шине; без них расширение ESB даёт больше данных, но не даёт актуальности и динамических прав доступа. Это, вероятно, узкое место волны 2, а не только общий пункт бэклога платформы.</w:t>
+        <w:rPr>
+          <w:b/>
+        </w:rPr>
+        <w:t>уже в плане на 4 квартал</w:t>
+      </w:r>
+      <w:r>
+        <w:t>, платформенная сторона не блокирует старт волны 2 в ожидаемые сроки.</w:t>
+      </w:r>
+    </w:p>
+    <w:p>
+      <w:r>
+        <w:t>- «Обновление информации о правах доступа... через таблицы/API» (высокий) — сроков пока нет, статус «Уточнить у заказчика». Это более реальный риск-фактор для волны 2 (и особенно для чувствительных волн 3+), чем первый пункт — см. пересмотренное предложение 4 в §6.</w:t>
+      </w:r>
+    </w:p>
+    <w:p>
+      <w:r>
+        <w:rPr>
+          <w:b/>
+        </w:rPr>
+        <w:t>Из 11 пунктов реестра только 4 помечены «Уточнить у заказчика»</w:t>
+      </w:r>
+      <w:r>
+        <w:t xml:space="preserve"> — именно они (и только они) взяты в список вопросов ниже (§5, раздел «Платформенные возможности»). Остальные 7 — либо уже запланированы платформой на конкретный квартал (мультидоменная авторизация, MS Office 365, обновление RAG через API, визуал графиков, документация, кастомные наименования замен), либо в статусе «Уточняем» силами самой платформенной команды, не требуют ответа от заказчика (поддержка API Claude/search) — вынесены из вопросов заказчику, чтобы не задавать то, что уже решается без него.</w:t>
       </w:r>
     </w:p>
     <w:p>
@@ -1350,12 +1625,7 @@
     </w:p>
     <w:p>
       <w:r>
-        <w:t>8. Права доступа сотрудников сейчас фиксированы по статичному списку политик. Для проекта это должно стать динамическим (через таблицы/API из системы-источника прав)? Если да — какая система является источником истины по правам (HR-система, Bitrix24, отдельный IAM)?</w:t>
-      </w:r>
-    </w:p>
-    <w:p>
-      <w:r>
-        <w:t>9. Нужна ли мультидоменная авторизация (из реестра платформы, критичный приоритет) — сколько доменов/поддоменов у Д8 предполагается подключить?</w:t>
+        <w:t>8. Права доступа сотрудников сейчас фиксированы по статичному списку политик. Для проекта это должно стать динамическим (через таблицы/API из системы-источника прав)? Если да — какая система является источником истины по правам (HR-система, Bitrix24, отдельный IAM)? *(= пункт реестра «Обновление информации о правах доступа...», Уточнить у заказчика)*</w:t>
       </w:r>
     </w:p>
     <w:p>
@@ -1368,12 +1638,12 @@
     </w:p>
     <w:p>
       <w:r>
-        <w:t>10. Email, Word/PDF-регламенты, Confluence из мастер-ТЗ (§1.2) — они не входили в пилот. Подтверждается ли, что они НЕ входят и в проект (за вычетом того, что может решиться толкованием волны 1(а)), или это отдельный вопрос, который ещё предстоит решить?</w:t>
+        <w:t>9. Email, Word/PDF-регламенты, Confluence из мастер-ТЗ (§1.2) — они не входили в пилот. Подтверждается ли, что они НЕ входят и в проект (за вычетом того, что может решиться толкованием волны 1(а)), или это отдельный вопрос, который ещё предстоит решить?</w:t>
       </w:r>
     </w:p>
     <w:p>
       <w:r>
-        <w:t>11. Email в мастер-ТЗ помечен Must Have, но тест-кейсы (TC-EMAIL) отсутствовали уже в пилоте — снимается ли это требование в проекте или переносится?</w:t>
+        <w:t>10. Email в мастер-ТЗ помечен Must Have, но тест-кейсы (TC-EMAIL) отсутствовали уже в пилоте — снимается ли это требование в проекте или переносится?</w:t>
       </w:r>
     </w:p>
     <w:p>
@@ -1381,27 +1651,22 @@
         <w:pStyle w:val="Heading3"/>
       </w:pPr>
       <w:r>
-        <w:t>Платформенные возможности (из реестра §4)</w:t>
+        <w:t>Платформенные возможности — только пункты реестра, помеченные «Уточнить у заказчика»</w:t>
       </w:r>
     </w:p>
     <w:p>
       <w:r>
-        <w:t>12. Актуализация RAG-баз через API (высокий приоритет в реестре) — это блокер для волны 2 или можно стартовать с ручным/пакетным обновлением?</w:t>
+        <w:t>11. Кастомизация выбора источников — нужна ли возможность подключать/отключать источники данных внутри компании прямо в режиме чата и через API, или фиксированный набор источников на пользователя/роль достаточен?</w:t>
       </w:r>
     </w:p>
     <w:p>
       <w:r>
-        <w:t>13. Персональные RAG-коллекции пользователей — нужны ли для проекта Д8, или это общий продуктовый пункт не по конкретному запросу заказчика?</w:t>
+        <w:t>12. Персональные RAG-коллекции пользователей — нужна ли пользователям возможность самим создавать RAG-коллекции и делиться ими с коллегами (вместо текущего набора файлов), или это не актуально для Д8?</w:t>
       </w:r>
     </w:p>
     <w:p>
       <w:r>
-        <w:t>14. Работа с MS Office 365 — есть ли у Д8 контур O365 (SharePoint/Outlook/Teams), который нужно подключать, или пункт не относится к этому проекту?</w:t>
-      </w:r>
-    </w:p>
-    <w:p>
-      <w:r>
-        <w:t>15. Поддержка актуальной версии API внешней модели (web search и т.п.) — есть ли у Д8 конкретный сценарий использования веб-поиска, который сейчас блокирован?</w:t>
+        <w:t>13. Упрощение заведения пользователей — что именно сейчас неудобно в процессе добавления новых пользователей на стороне Д8? (нужен конкретный сценарий, чтобы платформа могла спроектировать упрощение по делу)</w:t>
       </w:r>
     </w:p>
     <w:p>
@@ -1414,12 +1679,12 @@
     </w:p>
     <w:p>
       <w:r>
-        <w:t>16. Кто со стороны Д8 — новый владелец процесса на фазе П4 (промышленная эксплуатация)? Тот же технический контакт, что в пилоте, или отдельная выделенная роль/команда?</w:t>
+        <w:t>14. Кто со стороны Д8 — новый владелец процесса на фазе П4 (промышленная эксплуатация)? Тот же технический контакт, что в пилоте, или отдельная выделенная роль/команда?</w:t>
       </w:r>
     </w:p>
     <w:p>
       <w:r>
-        <w:t xml:space="preserve">17. Формальный критерий перехода в проект: пилот по </w:t>
+        <w:t xml:space="preserve">15. Формальный критерий перехода в проект: пилот по </w:t>
       </w:r>
       <w:r>
         <w:rPr>
@@ -1475,7 +1740,7 @@
         <w:t>Решение по ESB/КХД (волна 2) зафиксировать письменно как есть — расширение, не сужение.</w:t>
       </w:r>
       <w:r>
-        <w:t xml:space="preserve"> Предлагаем формулировку для проектного ТЗ: «Все 3 пилотных источника (КХД, ESB/CRM, MCP-сервер) остаются в проекте; ESB и КХД получают расширение (витрины/API), MCP-сервер — на пилотном уровне; «RAG-компании» исключён из скоупа как опечатка/дублирующее название». Источники вне пилотной тройки — отдельный, пока не решённый вопрос (вопрос 10), не путать с этим решением.</w:t>
+        <w:t xml:space="preserve"> Предлагаем формулировку для проектного ТЗ: «Все 3 пилотных источника (КХД, ESB/CRM, MCP-сервер) остаются в проекте; ESB и КХД получают расширение (витрины/API), MCP-сервер — на пилотном уровне; «RAG-компании» исключён из скоупа как опечатка/дублирующее название». Источники вне пилотной тройки — отдельный, пока не решённый вопрос (вопрос 9), не путать с этим решением.</w:t>
       </w:r>
     </w:p>
     <w:p>
@@ -1500,29 +1765,15 @@
         <w:rPr>
           <w:b/>
         </w:rPr>
-        <w:t>Динамические права доступа и обновление RAG через API — не блокировать волну 2, но зафиксировать как gate для поздних волн.</w:t>
+        <w:t>Динамические права доступа (вопрос 8) — не блокировать волну 2, но зафиксировать как gate для поздних волн.</w:t>
       </w:r>
       <w:r>
-        <w:t xml:space="preserve"> Оба пункта сейчас в статусе «требует проработки» на стороне платформы (реестр §4), то есть ждать их полной готовности перед стартом волны 2 нецелесообразно. Предлагаем: волну 2 запускать на статичной модели прав (как в пилоте), но заложить в архитектуру совместимость с будущим переходом на API-модель — и явно зафиксировать, что волны с данными повышенной чувствительности (комплаенс, бэк-офис, кандидаты для волны 3+) не начинаются, пока оба пункта не готовы.</w:t>
+        <w:t xml:space="preserve"> На стороне платформы срока пока нет («Уточнить у заказчика» в реестре — платформа тоже ждёт ответа Д8). Предлагаем: волну 2 запускать на статичной модели прав (как в пилоте), но заложить в архитектуру совместимость с будущим переходом на API-модель — и явно зафиксировать, что волны с данными повышенной чувствительности (комплаенс, бэк-офис, кандидаты для волны 3+) не начинаются, пока это не готово с обеих сторон (ответ Д8 + реализация платформы). Отдельно: «Обновление данных в RAG через API» — уже в плане платформы на 4 квартал, для этого пункта отдельного вопроса заказчику не нужно, только держать в поле зрения срок.</w:t>
       </w:r>
     </w:p>
     <w:p>
       <w:r>
         <w:t xml:space="preserve">5. </w:t>
-      </w:r>
-      <w:r>
-        <w:rPr>
-          <w:b/>
-        </w:rPr>
-        <w:t>Мультидоменная авторизация (критичный приоритет в реестре платформы) — предлагаем сначала оспорить применимость, а не сразу проектировать под неё.</w:t>
-      </w:r>
-      <w:r>
-        <w:t xml:space="preserve"> Ни в одном документе базы нет признаков того, что Д8 — холдинг с несколькими доменами; известная оргструктура — одна компания. Прежде чем закладывать эту возможность в скоуп проекта, стоит явно спросить у заказчика, актуальна ли она для Д8 конкретно.</w:t>
-      </w:r>
-    </w:p>
-    <w:p>
-      <w:r>
-        <w:t xml:space="preserve">6. </w:t>
       </w:r>
       <w:r>
         <w:rPr>
@@ -1536,40 +1787,16 @@
     </w:p>
     <w:p>
       <w:r>
-        <w:t xml:space="preserve">7. </w:t>
+        <w:t xml:space="preserve">6. </w:t>
       </w:r>
       <w:r>
         <w:rPr>
           <w:b/>
         </w:rPr>
-        <w:t>Критерий перехода (вопрос 17) — предлагаем не ждать дозакрытия сценариев 6 и 4.</w:t>
+        <w:t>Критерий перехода (вопрос 15) — предлагаем не ждать дозакрытия сценариев 6 и 4.</w:t>
       </w:r>
       <w:r>
         <w:t xml:space="preserve"> По методике (§4.1 Кейса 2) переход не требует 100% pass. Предлагаем перенести оба открытых пункта в явный «список долга» бизнес-кейса П1 — с обязательством закрыть их в рамках волны 1 или 2, а не тихо забыть при переходе в проект.</w:t>
-      </w:r>
-    </w:p>
-    <w:p>
-      <w:r>
-        <w:t xml:space="preserve">8. </w:t>
-      </w:r>
-      <w:r>
-        <w:rPr>
-          <w:b/>
-        </w:rPr>
-        <w:t>Реестр платформенных пунктов (§4) — предлагаем выделить в отдельный трек переговоров с вендором, не смешивать с вопросами к заказчику.</w:t>
-      </w:r>
-      <w:r>
-        <w:t xml:space="preserve"> «Обновление данных в RAG через API» и «динамические права доступа» — это зависимости волны 2 от роадмапа вендора, а не то, что решает сам заказчик. Рекомендуем формализовать как два конкретных технических запроса вендору со сроками, по аналогии с </w:t>
-      </w:r>
-      <w:r>
-        <w:rPr>
-          <w:rFonts w:ascii="Consolas" w:hAnsi="Consolas"/>
-          <w:sz w:val="20"/>
-        </w:rPr>
-        <w:t>case-11-voprosy-vendoru-roadmap.md</w:t>
-      </w:r>
-      <w:r>
-        <w:t>.</w:t>
       </w:r>
     </w:p>
     <w:p>
@@ -1642,7 +1869,7 @@
         <w:t>docs/analysis/case-21-pereotsenka-scenariev-6-i-4-po-kriteriyam-priemki.md</w:t>
       </w:r>
       <w:r>
-        <w:t>](case-21-pereotsenka-scenariev-6-i-4-po-kriteriyam-priemki.md) — формальный статус приёмки пилота (вопрос 17).</w:t>
+        <w:t>](case-21-pereotsenka-scenariev-6-i-4-po-kriteriyam-priemki.md) — формальный статус приёмки пилота (вопрос 15).</w:t>
       </w:r>
     </w:p>
     <w:sectPr>

</xml_diff>

<commit_message>
Fix РАГ -> RAG naming throughout scope docs
Co-Authored-By: Claude Sonnet 5 <noreply@anthropic.com>
Claude-Session: https://claude.ai/code/session_01DpSN8JwCJ3tg3JVUadr2zE
</commit_message>
<xml_diff>
--- a/docs/analysis/case-27-proekt-d8-skoup-i-voprosy.docx
+++ b/docs/analysis/case-27-proekt-d8-skoup-i-voprosy.docx
@@ -656,7 +656,7 @@
           </w:tcPr>
           <w:p>
             <w:r>
-              <w:t>РАГ-документы</w:t>
+              <w:t>RAG-документы</w:t>
             </w:r>
           </w:p>
         </w:tc>
@@ -741,7 +741,7 @@
         <w:pStyle w:val="Heading3"/>
       </w:pPr>
       <w:r>
-        <w:t>Волна 1 — «РАГ-документы»: что нужно уточнить</w:t>
+        <w:t>Волна 1 — «RAG-документы»: что нужно уточнить</w:t>
       </w:r>
     </w:p>
     <w:p>
@@ -1574,7 +1574,7 @@
     </w:p>
     <w:p>
       <w:r>
-        <w:t>1. Волна 1 «РАГ-документы» — что именно имеется в виду: (а) новые типы документов сверх пилотных двух коллекций, (б) улучшение качества/покрытия уже загруженного, или (в) отдельная новая коллекция под конкретную задачу/подразделение?</w:t>
+        <w:t>1. Волна 1 «RAG-документы» — что именно имеется в виду: (а) новые типы документов сверх пилотных двух коллекций, (б) улучшение качества/покрытия уже загруженного, или (в) отдельная новая коллекция под конкретную задачу/подразделение?</w:t>
       </w:r>
     </w:p>
     <w:p>

</xml_diff>

<commit_message>
Remove inline "Источник: file.md" citation clutter from pilot-scope line
Co-Authored-By: Claude Sonnet 5 <noreply@anthropic.com>
Claude-Session: https://claude.ai/code/session_01DpSN8JwCJ3tg3JVUadr2zE
</commit_message>
<xml_diff>
--- a/docs/analysis/case-27-proekt-d8-skoup-i-voprosy.docx
+++ b/docs/analysis/case-27-proekt-d8-skoup-i-voprosy.docx
@@ -54,27 +54,7 @@
     </w:p>
     <w:p>
       <w:r>
-        <w:t xml:space="preserve">3 источника данных (КХД, CRM Bitrix24 через ESB, MCP-сервер), 2 согласованные роли из «до 5 в перспективе», 2 коллекции документов, до 20 пилотных пользователей. Источник: </w:t>
-      </w:r>
-      <w:r>
-        <w:rPr>
-          <w:rFonts w:ascii="Consolas" w:hAnsi="Consolas"/>
-          <w:sz w:val="20"/>
-        </w:rPr>
-        <w:t>case-03-pilot-tz-ai-guard.md</w:t>
-      </w:r>
-      <w:r>
-        <w:t xml:space="preserve">, </w:t>
-      </w:r>
-      <w:r>
-        <w:rPr>
-          <w:rFonts w:ascii="Consolas" w:hAnsi="Consolas"/>
-          <w:sz w:val="20"/>
-        </w:rPr>
-        <w:t>docs/onboarding.md</w:t>
-      </w:r>
-      <w:r>
-        <w:t>.</w:t>
+        <w:t>3 источника данных (КХД, CRM Bitrix24 через ESB, MCP-сервер), 2 согласованные роли из «до 5 в перспективе», 2 коллекции документов, до 20 пилотных пользователей.</w:t>
       </w:r>
     </w:p>
     <w:p>

</xml_diff>

<commit_message>
Add Д8 project-scope presentation (program, Gantt, registry, questions)
Deck mirrors the finalized 3-sheet xlsx: программа проекта, диаграмма
Ганта для наглядности длительности этапов, реестр зафиксированных
пожеланий заказчика, и вопросы к заказчику разбиты на "по наполнению
этапов" и "по пожеланиям" с привязкой к пунктам реестра.

Co-Authored-By: Claude Sonnet 5 <noreply@anthropic.com>
Claude-Session: https://claude.ai/code/session_01DpSN8JwCJ3tg3JVUadr2zE
</commit_message>
<xml_diff>
--- a/docs/analysis/case-27-proekt-d8-skoup-i-voprosy.docx
+++ b/docs/analysis/case-27-proekt-d8-skoup-i-voprosy.docx
@@ -1801,6 +1801,36 @@
           <w:rFonts w:ascii="Consolas" w:hAnsi="Consolas"/>
           <w:sz w:val="20"/>
         </w:rPr>
+        <w:t>docs/presentations/case-27-proekt-d8-skoup-i-voprosy.pptx</w:t>
+      </w:r>
+      <w:r>
+        <w:t>](../presentations/case-27-proekt-d8-skoup-i-voprosy.pptx) — презентация: программа проекта, диаграмма Ганта, реестр предложений, вопросы к заказчику.</w:t>
+      </w:r>
+    </w:p>
+    <w:p>
+      <w:r>
+        <w:t>- [</w:t>
+      </w:r>
+      <w:r>
+        <w:rPr>
+          <w:rFonts w:ascii="Consolas" w:hAnsi="Consolas"/>
+          <w:sz w:val="20"/>
+        </w:rPr>
+        <w:t>docs/analysis/case-27-proekt-d8-skoup-i-voprosy.xlsx</w:t>
+      </w:r>
+      <w:r>
+        <w:t>](case-27-proekt-d8-skoup-i-voprosy.xlsx) — рабочая таблица (программа, вопросы, реестр).</w:t>
+      </w:r>
+    </w:p>
+    <w:p>
+      <w:r>
+        <w:t>- [</w:t>
+      </w:r>
+      <w:r>
+        <w:rPr>
+          <w:rFonts w:ascii="Consolas" w:hAnsi="Consolas"/>
+          <w:sz w:val="20"/>
+        </w:rPr>
         <w:t>docs/metodika-vnedreniya.md</w:t>
       </w:r>
       <w:r>

</xml_diff>

<commit_message>
Add wave-scope data checklist, pilot architecture diagram, dated Gantt
- Чек-лист (§3): 4 параметра для оценки скоупа любой волны (состав
  данных, количество витрин/коллекций, пользователей, ролей) отдельно
  для КХД/ESB и для RAG; вопросы 1, 3, 6 дополнены явным запросом чисел.
- Архитектура пилота: диаграмма (SVG + PNG) — платформа в центре,
  источники слева, получатели данных справа, по фактам пилота.
- Диаграмма Ганта в презентации переведена с недель на ориентировочные
  календарные даты (окт 2026 – апр 2027), явно показывает переход
  волны 3+/П4/П5 в 2027 год без фиксированного завершения.

Co-Authored-By: Claude Sonnet 5 <noreply@anthropic.com>
Claude-Session: https://claude.ai/code/session_01DpSN8JwCJ3tg3JVUadr2zE
</commit_message>
<xml_diff>
--- a/docs/analysis/case-27-proekt-d8-skoup-i-voprosy.docx
+++ b/docs/analysis/case-27-proekt-d8-skoup-i-voprosy.docx
@@ -559,6 +559,60 @@
         <w:pStyle w:val="Heading2"/>
       </w:pPr>
       <w:r>
+        <w:t>Архитектура пилота</w:t>
+      </w:r>
+    </w:p>
+    <w:p>
+      <w:r>
+        <w:t>Платформа в центре, источники данных слева (подключаются к ней), получатели — пользователи и их запросы — справа. Схема строго по фактам пилота (§1–2), не по проектному скоупу — расширение источников и ролей описано ниже, в §3.</w:t>
+      </w:r>
+    </w:p>
+    <w:p>
+      <w:r>
+        <w:drawing>
+          <wp:inline xmlns:a="http://schemas.openxmlformats.org/drawingml/2006/main" xmlns:pic="http://schemas.openxmlformats.org/drawingml/2006/picture">
+            <wp:extent cx="5760720" cy="3264408"/>
+            <wp:docPr id="1" name="Picture 1"/>
+            <wp:cNvGraphicFramePr>
+              <a:graphicFrameLocks noChangeAspect="1"/>
+            </wp:cNvGraphicFramePr>
+            <a:graphic>
+              <a:graphicData uri="http://schemas.openxmlformats.org/drawingml/2006/picture">
+                <pic:pic>
+                  <pic:nvPicPr>
+                    <pic:cNvPr id="0" name="case-27-arhitektura-pilota.png"/>
+                    <pic:cNvPicPr/>
+                  </pic:nvPicPr>
+                  <pic:blipFill>
+                    <a:blip r:embed="rId9"/>
+                    <a:stretch>
+                      <a:fillRect/>
+                    </a:stretch>
+                  </pic:blipFill>
+                  <pic:spPr>
+                    <a:xfrm>
+                      <a:off x="0" y="0"/>
+                      <a:ext cx="5760720" cy="3264408"/>
+                    </a:xfrm>
+                    <a:prstGeom prst="rect"/>
+                  </pic:spPr>
+                </pic:pic>
+              </a:graphicData>
+            </a:graphic>
+          </wp:inline>
+        </w:drawing>
+      </w:r>
+    </w:p>
+    <w:p>
+      <w:r>
+        <w:t>---</w:t>
+      </w:r>
+    </w:p>
+    <w:p>
+      <w:pPr>
+        <w:pStyle w:val="Heading2"/>
+      </w:pPr>
+      <w:r>
         <w:t>3. Волны проекта — черновая карта (главный открытый вопрос)</w:t>
       </w:r>
     </w:p>
@@ -820,6 +874,733 @@
     <w:p>
       <w:r>
         <w:t>- Промышленная эксплуатация (фаза П4 методики) — начинается не как отдельная волна, а как переход в режим SLA после того, как первые волны приняты.</w:t>
+      </w:r>
+    </w:p>
+    <w:p>
+      <w:pPr>
+        <w:pStyle w:val="Heading3"/>
+      </w:pPr>
+      <w:r>
+        <w:t>Чек-лист: данные для оценки скоупа волны</w:t>
+      </w:r>
+    </w:p>
+    <w:p>
+      <w:r>
+        <w:t xml:space="preserve">Оба вопроса «что входит в волну» (§5, вопросы 1 и 3) сейчас сформулированы как открытые — они спрашивают </w:t>
+      </w:r>
+      <w:r>
+        <w:rPr>
+          <w:b/>
+        </w:rPr>
+        <w:t>что</w:t>
+      </w:r>
+      <w:r>
+        <w:t xml:space="preserve">, но не </w:t>
+      </w:r>
+      <w:r>
+        <w:rPr>
+          <w:b/>
+        </w:rPr>
+        <w:t>сколько</w:t>
+      </w:r>
+      <w:r>
+        <w:t xml:space="preserve">. Без числовых параметров ниже нельзя оценить трудоёмкость волны даже приблизительно (а Кейс 2 методики и так не даёт оценок трудоёмкости из-за отсутствия прецедента — см. </w:t>
+      </w:r>
+      <w:r>
+        <w:rPr>
+          <w:rFonts w:ascii="Consolas" w:hAnsi="Consolas"/>
+          <w:sz w:val="20"/>
+        </w:rPr>
+        <w:t>docs/metodika-vnedreniya.md</w:t>
+      </w:r>
+      <w:r>
+        <w:t>, §4.3; закрыть эти 4 параметра — необходимое условие, чтобы вообще начать оценку, когда проект перейдёт в фазу П2).</w:t>
+      </w:r>
+    </w:p>
+    <w:p>
+      <w:r>
+        <w:t>Четыре параметра нужны для любой волны независимо от типа источника:</w:t>
+      </w:r>
+    </w:p>
+    <w:p>
+      <w:r>
+        <w:t xml:space="preserve">1. </w:t>
+      </w:r>
+      <w:r>
+        <w:rPr>
+          <w:b/>
+        </w:rPr>
+        <w:t>Состав данных</w:t>
+      </w:r>
+      <w:r>
+        <w:t xml:space="preserve"> — что технически входит (домен, конкретные сущности)</w:t>
+      </w:r>
+    </w:p>
+    <w:p>
+      <w:r>
+        <w:t xml:space="preserve">2. </w:t>
+      </w:r>
+      <w:r>
+        <w:rPr>
+          <w:b/>
+        </w:rPr>
+        <w:t>Количество витрин / коллекций</w:t>
+      </w:r>
+      <w:r>
+        <w:t xml:space="preserve"> — единица учёта объёма</w:t>
+      </w:r>
+    </w:p>
+    <w:p>
+      <w:r>
+        <w:t xml:space="preserve">3. </w:t>
+      </w:r>
+      <w:r>
+        <w:rPr>
+          <w:b/>
+        </w:rPr>
+        <w:t>Количество пользователей</w:t>
+      </w:r>
+      <w:r>
+        <w:t xml:space="preserve"> — кто получит доступ именно в рамках этой волны</w:t>
+      </w:r>
+    </w:p>
+    <w:p>
+      <w:r>
+        <w:t xml:space="preserve">4. </w:t>
+      </w:r>
+      <w:r>
+        <w:rPr>
+          <w:b/>
+        </w:rPr>
+        <w:t>Количество ролей</w:t>
+      </w:r>
+      <w:r>
+        <w:t xml:space="preserve"> — сколько ролевых профилей затронуто</w:t>
+      </w:r>
+    </w:p>
+    <w:p>
+      <w:r>
+        <w:t>#### Для КХД / ESB (волна 2)</w:t>
+      </w:r>
+    </w:p>
+    <w:tbl>
+      <w:tblPr>
+        <w:tblStyle w:val="TableGrid"/>
+        <w:tblW w:type="auto" w:w="0"/>
+        <w:tblLook w:firstColumn="1" w:firstRow="1" w:lastColumn="0" w:lastRow="0" w:noHBand="0" w:noVBand="1" w:val="04A0"/>
+      </w:tblPr>
+      <w:tblGrid>
+        <w:gridCol w:w="2160"/>
+        <w:gridCol w:w="2160"/>
+        <w:gridCol w:w="2160"/>
+        <w:gridCol w:w="2160"/>
+      </w:tblGrid>
+      <w:tr>
+        <w:tc>
+          <w:tcPr>
+            <w:tcW w:type="dxa" w:w="2160"/>
+          </w:tcPr>
+          <w:p>
+            <w:r>
+              <w:rPr>
+                <w:b/>
+              </w:rPr>
+              <w:t>Параметр</w:t>
+            </w:r>
+          </w:p>
+        </w:tc>
+        <w:tc>
+          <w:tcPr>
+            <w:tcW w:type="dxa" w:w="2160"/>
+          </w:tcPr>
+          <w:p>
+            <w:r>
+              <w:rPr>
+                <w:b/>
+              </w:rPr>
+              <w:t>Известно (пилот)</w:t>
+            </w:r>
+          </w:p>
+        </w:tc>
+        <w:tc>
+          <w:tcPr>
+            <w:tcW w:type="dxa" w:w="2160"/>
+          </w:tcPr>
+          <w:p>
+            <w:r>
+              <w:rPr>
+                <w:b/>
+              </w:rPr>
+              <w:t>Нужно уточнить у Д8</w:t>
+            </w:r>
+          </w:p>
+        </w:tc>
+        <w:tc>
+          <w:tcPr>
+            <w:tcW w:type="dxa" w:w="2160"/>
+          </w:tcPr>
+          <w:p>
+            <w:r>
+              <w:rPr>
+                <w:b/>
+              </w:rPr>
+              <w:t>Вопрос</w:t>
+            </w:r>
+          </w:p>
+        </w:tc>
+      </w:tr>
+      <w:tr>
+        <w:tc>
+          <w:tcPr>
+            <w:tcW w:type="dxa" w:w="2160"/>
+          </w:tcPr>
+          <w:p>
+            <w:r>
+              <w:t>Состав данных</w:t>
+            </w:r>
+          </w:p>
+        </w:tc>
+        <w:tc>
+          <w:tcPr>
+            <w:tcW w:type="dxa" w:w="2160"/>
+          </w:tcPr>
+          <w:p>
+            <w:r>
+              <w:t xml:space="preserve">4 таблицы: </w:t>
+            </w:r>
+            <w:r>
+              <w:rPr>
+                <w:rFonts w:ascii="Consolas" w:hAnsi="Consolas"/>
+                <w:sz w:val="20"/>
+              </w:rPr>
+              <w:t>crm.crm.crm.clients</w:t>
+            </w:r>
+            <w:r>
+              <w:t xml:space="preserve">, </w:t>
+            </w:r>
+            <w:r>
+              <w:rPr>
+                <w:rFonts w:ascii="Consolas" w:hAnsi="Consolas"/>
+                <w:sz w:val="20"/>
+              </w:rPr>
+              <w:t>crm.crm.crm.managers</w:t>
+            </w:r>
+            <w:r>
+              <w:t xml:space="preserve">, </w:t>
+            </w:r>
+            <w:r>
+              <w:rPr>
+                <w:rFonts w:ascii="Consolas" w:hAnsi="Consolas"/>
+                <w:sz w:val="20"/>
+              </w:rPr>
+              <w:t>trade.trade.trading.mandates_targets</w:t>
+            </w:r>
+            <w:r>
+              <w:t xml:space="preserve">, </w:t>
+            </w:r>
+            <w:r>
+              <w:rPr>
+                <w:rFonts w:ascii="Consolas" w:hAnsi="Consolas"/>
+                <w:sz w:val="20"/>
+              </w:rPr>
+              <w:t>trade.trade.trading.portfolios</w:t>
+            </w:r>
+            <w:r>
+              <w:t xml:space="preserve"> (у последней — известный пробел: значение портфеля не находится, хотя источник подключён, см. </w:t>
+            </w:r>
+            <w:r>
+              <w:rPr>
+                <w:rFonts w:ascii="Consolas" w:hAnsi="Consolas"/>
+                <w:sz w:val="20"/>
+              </w:rPr>
+              <w:t>case-01-d8-014-brief.md</w:t>
+            </w:r>
+            <w:r>
+              <w:t>)</w:t>
+            </w:r>
+          </w:p>
+        </w:tc>
+        <w:tc>
+          <w:tcPr>
+            <w:tcW w:type="dxa" w:w="2160"/>
+          </w:tcPr>
+          <w:p>
+            <w:r>
+              <w:t>Новые витрины/таблицы: домен, ключевые поля, владелец на стороне Д8, объём (строк / размер)</w:t>
+            </w:r>
+          </w:p>
+        </w:tc>
+        <w:tc>
+          <w:tcPr>
+            <w:tcW w:type="dxa" w:w="2160"/>
+          </w:tcPr>
+          <w:p>
+            <w:r>
+              <w:t>Вопрос 3</w:t>
+            </w:r>
+          </w:p>
+        </w:tc>
+      </w:tr>
+      <w:tr>
+        <w:tc>
+          <w:tcPr>
+            <w:tcW w:type="dxa" w:w="2160"/>
+          </w:tcPr>
+          <w:p>
+            <w:r>
+              <w:t>Количество витрин</w:t>
+            </w:r>
+          </w:p>
+        </w:tc>
+        <w:tc>
+          <w:tcPr>
+            <w:tcW w:type="dxa" w:w="2160"/>
+          </w:tcPr>
+          <w:p>
+            <w:r>
+              <w:t>4 (пилот)</w:t>
+            </w:r>
+          </w:p>
+        </w:tc>
+        <w:tc>
+          <w:tcPr>
+            <w:tcW w:type="dxa" w:w="2160"/>
+          </w:tcPr>
+          <w:p>
+            <w:r>
+              <w:t>Точное число витрин сверх пилотных 4 — сейчас вопрос 3 спрашивает список, но не просит явно назвать количество</w:t>
+            </w:r>
+          </w:p>
+        </w:tc>
+        <w:tc>
+          <w:tcPr>
+            <w:tcW w:type="dxa" w:w="2160"/>
+          </w:tcPr>
+          <w:p>
+            <w:r>
+              <w:t>Вопрос 3 — дополнить формулировку</w:t>
+            </w:r>
+          </w:p>
+        </w:tc>
+      </w:tr>
+      <w:tr>
+        <w:tc>
+          <w:tcPr>
+            <w:tcW w:type="dxa" w:w="2160"/>
+          </w:tcPr>
+          <w:p>
+            <w:r>
+              <w:t>API в шине</w:t>
+            </w:r>
+          </w:p>
+        </w:tc>
+        <w:tc>
+          <w:tcPr>
+            <w:tcW w:type="dxa" w:w="2160"/>
+          </w:tcPr>
+          <w:p>
+            <w:r>
+              <w:t>1 интеграция: CRM Bitrix24, REST API/Webhook</w:t>
+            </w:r>
+          </w:p>
+        </w:tc>
+        <w:tc>
+          <w:tcPr>
+            <w:tcW w:type="dxa" w:w="2160"/>
+          </w:tcPr>
+          <w:p>
+            <w:r>
+              <w:t>Список новых API: система-источник, формат (REST/SOAP/др.), ответственный на стороне Д8 за контракт</w:t>
+            </w:r>
+          </w:p>
+        </w:tc>
+        <w:tc>
+          <w:tcPr>
+            <w:tcW w:type="dxa" w:w="2160"/>
+          </w:tcPr>
+          <w:p>
+            <w:r>
+              <w:t>Вопрос 4</w:t>
+            </w:r>
+          </w:p>
+        </w:tc>
+      </w:tr>
+      <w:tr>
+        <w:tc>
+          <w:tcPr>
+            <w:tcW w:type="dxa" w:w="2160"/>
+          </w:tcPr>
+          <w:p>
+            <w:r>
+              <w:t>Количество пользователей</w:t>
+            </w:r>
+          </w:p>
+        </w:tc>
+        <w:tc>
+          <w:tcPr>
+            <w:tcW w:type="dxa" w:w="2160"/>
+          </w:tcPr>
+          <w:p>
+            <w:r>
+              <w:t>до 20 (пилот, все роли вместе)</w:t>
+            </w:r>
+          </w:p>
+        </w:tc>
+        <w:tc>
+          <w:tcPr>
+            <w:tcW w:type="dxa" w:w="2160"/>
+          </w:tcPr>
+          <w:p>
+            <w:r>
+              <w:t>Сколько пользователей получат доступ именно к расширенным данным волны 2 — не общий штат, а конкретный контур волны</w:t>
+            </w:r>
+          </w:p>
+        </w:tc>
+        <w:tc>
+          <w:tcPr>
+            <w:tcW w:type="dxa" w:w="2160"/>
+          </w:tcPr>
+          <w:p>
+            <w:r>
+              <w:t>Новый пункт — добавить к вопросу 6</w:t>
+            </w:r>
+          </w:p>
+        </w:tc>
+      </w:tr>
+      <w:tr>
+        <w:tc>
+          <w:tcPr>
+            <w:tcW w:type="dxa" w:w="2160"/>
+          </w:tcPr>
+          <w:p>
+            <w:r>
+              <w:t>Количество ролей</w:t>
+            </w:r>
+          </w:p>
+        </w:tc>
+        <w:tc>
+          <w:tcPr>
+            <w:tcW w:type="dxa" w:w="2160"/>
+          </w:tcPr>
+          <w:p>
+            <w:r>
+              <w:t>2 из «до 5» по пилотному ТЗ</w:t>
+            </w:r>
+          </w:p>
+        </w:tc>
+        <w:tc>
+          <w:tcPr>
+            <w:tcW w:type="dxa" w:w="2160"/>
+          </w:tcPr>
+          <w:p>
+            <w:r>
+              <w:t>Волна 2 работает в рамках тех же 2 ролей, что пилот, или подключает новые</w:t>
+            </w:r>
+          </w:p>
+        </w:tc>
+        <w:tc>
+          <w:tcPr>
+            <w:tcW w:type="dxa" w:w="2160"/>
+          </w:tcPr>
+          <w:p>
+            <w:r>
+              <w:t>Вопрос 6</w:t>
+            </w:r>
+          </w:p>
+        </w:tc>
+      </w:tr>
+    </w:tbl>
+    <w:p>
+      <w:r>
+        <w:t>#### Для RAG (волна 1)</w:t>
+      </w:r>
+    </w:p>
+    <w:tbl>
+      <w:tblPr>
+        <w:tblStyle w:val="TableGrid"/>
+        <w:tblW w:type="auto" w:w="0"/>
+        <w:tblLook w:firstColumn="1" w:firstRow="1" w:lastColumn="0" w:lastRow="0" w:noHBand="0" w:noVBand="1" w:val="04A0"/>
+      </w:tblPr>
+      <w:tblGrid>
+        <w:gridCol w:w="2160"/>
+        <w:gridCol w:w="2160"/>
+        <w:gridCol w:w="2160"/>
+        <w:gridCol w:w="2160"/>
+      </w:tblGrid>
+      <w:tr>
+        <w:tc>
+          <w:tcPr>
+            <w:tcW w:type="dxa" w:w="2160"/>
+          </w:tcPr>
+          <w:p>
+            <w:r>
+              <w:rPr>
+                <w:b/>
+              </w:rPr>
+              <w:t>Параметр</w:t>
+            </w:r>
+          </w:p>
+        </w:tc>
+        <w:tc>
+          <w:tcPr>
+            <w:tcW w:type="dxa" w:w="2160"/>
+          </w:tcPr>
+          <w:p>
+            <w:r>
+              <w:rPr>
+                <w:b/>
+              </w:rPr>
+              <w:t>Известно (пилот)</w:t>
+            </w:r>
+          </w:p>
+        </w:tc>
+        <w:tc>
+          <w:tcPr>
+            <w:tcW w:type="dxa" w:w="2160"/>
+          </w:tcPr>
+          <w:p>
+            <w:r>
+              <w:rPr>
+                <w:b/>
+              </w:rPr>
+              <w:t>Нужно уточнить у Д8</w:t>
+            </w:r>
+          </w:p>
+        </w:tc>
+        <w:tc>
+          <w:tcPr>
+            <w:tcW w:type="dxa" w:w="2160"/>
+          </w:tcPr>
+          <w:p>
+            <w:r>
+              <w:rPr>
+                <w:b/>
+              </w:rPr>
+              <w:t>Вопрос</w:t>
+            </w:r>
+          </w:p>
+        </w:tc>
+      </w:tr>
+      <w:tr>
+        <w:tc>
+          <w:tcPr>
+            <w:tcW w:type="dxa" w:w="2160"/>
+          </w:tcPr>
+          <w:p>
+            <w:r>
+              <w:t>Состав данных</w:t>
+            </w:r>
+          </w:p>
+        </w:tc>
+        <w:tc>
+          <w:tcPr>
+            <w:tcW w:type="dxa" w:w="2160"/>
+          </w:tcPr>
+          <w:p>
+            <w:r>
+              <w:t>2 RAG-коллекции пилота (конкретная тематика документов не зафиксирована ни в одном кейсе базы)</w:t>
+            </w:r>
+          </w:p>
+        </w:tc>
+        <w:tc>
+          <w:tcPr>
+            <w:tcW w:type="dxa" w:w="2160"/>
+          </w:tcPr>
+          <w:p>
+            <w:r>
+              <w:t>Зависит от толкования (а/б/в выше): при (а) — какие именно типы документов добавляются (кандидаты из мастер-ТЗ §1.2: договоры ДУ, декларации, меморандумы, внутренние регламенты)</w:t>
+            </w:r>
+          </w:p>
+        </w:tc>
+        <w:tc>
+          <w:tcPr>
+            <w:tcW w:type="dxa" w:w="2160"/>
+          </w:tcPr>
+          <w:p>
+            <w:r>
+              <w:t>Вопрос 1</w:t>
+            </w:r>
+          </w:p>
+        </w:tc>
+      </w:tr>
+      <w:tr>
+        <w:tc>
+          <w:tcPr>
+            <w:tcW w:type="dxa" w:w="2160"/>
+          </w:tcPr>
+          <w:p>
+            <w:r>
+              <w:t>Количество коллекций</w:t>
+            </w:r>
+          </w:p>
+        </w:tc>
+        <w:tc>
+          <w:tcPr>
+            <w:tcW w:type="dxa" w:w="2160"/>
+          </w:tcPr>
+          <w:p>
+            <w:r>
+              <w:t>2 (пилот)</w:t>
+            </w:r>
+          </w:p>
+        </w:tc>
+        <w:tc>
+          <w:tcPr>
+            <w:tcW w:type="dxa" w:w="2160"/>
+          </w:tcPr>
+          <w:p>
+            <w:r>
+              <w:t>Волна 1 расширяет существующие 2 коллекции или создаёт новые — и если новые, сколько</w:t>
+            </w:r>
+          </w:p>
+        </w:tc>
+        <w:tc>
+          <w:tcPr>
+            <w:tcW w:type="dxa" w:w="2160"/>
+          </w:tcPr>
+          <w:p>
+            <w:r>
+              <w:t>Вопрос 1 — дополнить формулировку</w:t>
+            </w:r>
+          </w:p>
+        </w:tc>
+      </w:tr>
+      <w:tr>
+        <w:tc>
+          <w:tcPr>
+            <w:tcW w:type="dxa" w:w="2160"/>
+          </w:tcPr>
+          <w:p>
+            <w:r>
+              <w:t>Количество документов</w:t>
+            </w:r>
+          </w:p>
+        </w:tc>
+        <w:tc>
+          <w:tcPr>
+            <w:tcW w:type="dxa" w:w="2160"/>
+          </w:tcPr>
+          <w:p>
+            <w:r>
+              <w:t>Не зафиксировано — объём пилотного корпуса неизвестен по имеющимся кейсам</w:t>
+            </w:r>
+          </w:p>
+        </w:tc>
+        <w:tc>
+          <w:tcPr>
+            <w:tcW w:type="dxa" w:w="2160"/>
+          </w:tcPr>
+          <w:p>
+            <w:r>
+              <w:t>Оценка объёма: количество документов, средний размер, темп прироста (важно для оценки индексации и стоимости хранения)</w:t>
+            </w:r>
+          </w:p>
+        </w:tc>
+        <w:tc>
+          <w:tcPr>
+            <w:tcW w:type="dxa" w:w="2160"/>
+          </w:tcPr>
+          <w:p>
+            <w:r>
+              <w:t>Новый пункт — добавить к вопросу 1</w:t>
+            </w:r>
+          </w:p>
+        </w:tc>
+      </w:tr>
+      <w:tr>
+        <w:tc>
+          <w:tcPr>
+            <w:tcW w:type="dxa" w:w="2160"/>
+          </w:tcPr>
+          <w:p>
+            <w:r>
+              <w:t>Количество пользователей</w:t>
+            </w:r>
+          </w:p>
+        </w:tc>
+        <w:tc>
+          <w:tcPr>
+            <w:tcW w:type="dxa" w:w="2160"/>
+          </w:tcPr>
+          <w:p>
+            <w:r>
+              <w:t>до 20 (пилот)</w:t>
+            </w:r>
+          </w:p>
+        </w:tc>
+        <w:tc>
+          <w:tcPr>
+            <w:tcW w:type="dxa" w:w="2160"/>
+          </w:tcPr>
+          <w:p>
+            <w:r>
+              <w:t>Тот же контур пользователей, что в пилоте, или волна 1 открывает доступ новым</w:t>
+            </w:r>
+          </w:p>
+        </w:tc>
+        <w:tc>
+          <w:tcPr>
+            <w:tcW w:type="dxa" w:w="2160"/>
+          </w:tcPr>
+          <w:p>
+            <w:r>
+              <w:t>Новый пункт — добавить к вопросу 6</w:t>
+            </w:r>
+          </w:p>
+        </w:tc>
+      </w:tr>
+      <w:tr>
+        <w:tc>
+          <w:tcPr>
+            <w:tcW w:type="dxa" w:w="2160"/>
+          </w:tcPr>
+          <w:p>
+            <w:r>
+              <w:t>Количество ролей</w:t>
+            </w:r>
+          </w:p>
+        </w:tc>
+        <w:tc>
+          <w:tcPr>
+            <w:tcW w:type="dxa" w:w="2160"/>
+          </w:tcPr>
+          <w:p>
+            <w:r>
+              <w:t>2 (пилот)</w:t>
+            </w:r>
+          </w:p>
+        </w:tc>
+        <w:tc>
+          <w:tcPr>
+            <w:tcW w:type="dxa" w:w="2160"/>
+          </w:tcPr>
+          <w:p>
+            <w:r>
+              <w:t>Какие роли получают доступ к волне 1</w:t>
+            </w:r>
+          </w:p>
+        </w:tc>
+        <w:tc>
+          <w:tcPr>
+            <w:tcW w:type="dxa" w:w="2160"/>
+          </w:tcPr>
+          <w:p>
+            <w:r>
+              <w:t>Вопрос 6</w:t>
+            </w:r>
+          </w:p>
+        </w:tc>
+      </w:tr>
+    </w:tbl>
+    <w:p>
+      <w:r>
+        <w:rPr>
+          <w:b/>
+        </w:rPr>
+        <w:t>Как использовать:</w:t>
+      </w:r>
+      <w:r>
+        <w:t xml:space="preserve"> это рабочий шаблон сбора данных, не готовый вопрос заказчику — заполняется по итогам созвона по волне 1 (предложение 1, §6) и по ответам на вопросы 3–6. Тот же шаблон (4 параметра) переиспользуется для волны 3+, когда её содержание определится.</w:t>
       </w:r>
     </w:p>
     <w:p>
@@ -1554,7 +2335,7 @@
     </w:p>
     <w:p>
       <w:r>
-        <w:t>1. Волна 1 «RAG-документы» — что именно имеется в виду: (а) новые типы документов сверх пилотных двух коллекций, (б) улучшение качества/покрытия уже загруженного, или (в) отдельная новая коллекция под конкретную задачу/подразделение?</w:t>
+        <w:t>1. Волна 1 «RAG-документы» — что именно имеется в виду: (а) новые типы документов сверх пилотных двух коллекций, (б) улучшение качества/покрытия уже загруженного, или (в) отдельная новая коллекция под конкретную задачу/подразделение? Для оценки объёма: сколько коллекций в результате (расширяются существующие 2 или добавляются новые — и сколько), и примерный объём корпуса (количество документов, средний размер, темп прироста).</w:t>
       </w:r>
     </w:p>
     <w:p>
@@ -1572,7 +2353,47 @@
     </w:p>
     <w:p>
       <w:r>
-        <w:t>3. Какие конкретно витрины данных нужно добавить в ESB сверх текущего среза CRM (Bitrix24)? Список витрин с владельцами на стороне Д8.</w:t>
+        <w:t>3. Какие конкретно витрины данных нужно добавить в ESB сверх текущего среза CRM (Bitrix24)? Нужен список с владельцами на стороне Д8 — и явное число: сколько витрин добавляется сверх пилотных 4 (</w:t>
+      </w:r>
+      <w:r>
+        <w:rPr>
+          <w:rFonts w:ascii="Consolas" w:hAnsi="Consolas"/>
+          <w:sz w:val="20"/>
+        </w:rPr>
+        <w:t>crm.crm.crm.clients</w:t>
+      </w:r>
+      <w:r>
+        <w:t xml:space="preserve">, </w:t>
+      </w:r>
+      <w:r>
+        <w:rPr>
+          <w:rFonts w:ascii="Consolas" w:hAnsi="Consolas"/>
+          <w:sz w:val="20"/>
+        </w:rPr>
+        <w:t>crm.crm.crm.managers</w:t>
+      </w:r>
+      <w:r>
+        <w:t xml:space="preserve">, </w:t>
+      </w:r>
+      <w:r>
+        <w:rPr>
+          <w:rFonts w:ascii="Consolas" w:hAnsi="Consolas"/>
+          <w:sz w:val="20"/>
+        </w:rPr>
+        <w:t>trade.trade.trading.mandates_targets</w:t>
+      </w:r>
+      <w:r>
+        <w:t xml:space="preserve">, </w:t>
+      </w:r>
+      <w:r>
+        <w:rPr>
+          <w:rFonts w:ascii="Consolas" w:hAnsi="Consolas"/>
+          <w:sz w:val="20"/>
+        </w:rPr>
+        <w:t>trade.trade.trading.portfolios</w:t>
+      </w:r>
+      <w:r>
+        <w:t>).</w:t>
       </w:r>
     </w:p>
     <w:p>
@@ -1595,7 +2416,7 @@
     </w:p>
     <w:p>
       <w:r>
-        <w:t>6. Реальная оргструктура для проекта: список подразделений/ролей с числом пользователей в каждой (не гипотетическая таблица из мастер-ТЗ, а факт) — нужна для карты волн 3+.</w:t>
+        <w:t>6. Реальная оргструктура для проекта: список подразделений/ролей с числом пользователей в каждой (не гипотетическая таблица из мастер-ТЗ, а факт) — нужна для карты волн 3+. Отдельно по волнам 1 и 2: сколько пользователей и какие именно роли получают доступ в рамках именно этой волны (не общий штат) — тот же контур, что в пилоте (до 20 пользователей, 2 роли), или шире.</w:t>
       </w:r>
     </w:p>
     <w:p>

</xml_diff>

<commit_message>
Rework D8 deck: architecture slide, per-wave checklist, refined questions
- Презентация: добавлен слайд архитектуры пилота (2/6), вопросы по
  волнам переведены из плоской таблицы в 3 карточки (Волна 1/2/3+),
  каждая по единому набору параметров — состав данных, витрины/
  коллекции, пользователи, роли; вопросы 6/7/12 из старой таблицы
  поглощены этим форматом. Обложка: убраны путь к xlsx и дата среза.
- Вопросы 8-11 (права доступа, кастомизация источников, персональные
  RAG-коллекции, упрощение регистрации) переформулированы по прямым
  уточнениям заказчика — синхронизировано в md/docx/xlsx/pptx.

Co-Authored-By: Claude Sonnet 5 <noreply@anthropic.com>
Claude-Session: https://claude.ai/code/session_01DpSN8JwCJ3tg3JVUadr2zE
</commit_message>
<xml_diff>
--- a/docs/analysis/case-27-proekt-d8-skoup-i-voprosy.docx
+++ b/docs/analysis/case-27-proekt-d8-skoup-i-voprosy.docx
@@ -2426,7 +2426,7 @@
     </w:p>
     <w:p>
       <w:r>
-        <w:t>8. Права доступа сотрудников сейчас фиксированы по статичному списку политик. Для проекта это должно стать динамическим (через таблицы/API из системы-источника прав)? Если да — какая система является источником истины по правам (HR-система, Bitrix24, отдельный IAM)? *(= пункт реестра «Обновление информации о правах доступа...», Уточнить у заказчика)*</w:t>
+        <w:t>8. Права доступа сотрудников сейчас фиксированы по статичному списку политик. Для проекта это должно стать динамическим через API — но нужна точная схема процесса: права хранятся и администрируются внутри самой платформы (и меняются там же), или платформа только получает их из внешней системы-источника через API и применяет как есть? Если второе — какая система источник истины (HR-система, Bitrix24, отдельный IAM) и как часто права обновляются? *(= пункт реестра «Обновление информации о правах доступа...», Уточнить у заказчика)*</w:t>
       </w:r>
     </w:p>
     <w:p>
@@ -2457,17 +2457,17 @@
     </w:p>
     <w:p>
       <w:r>
-        <w:t>11. Кастомизация выбора источников — нужна ли возможность подключать/отключать источники данных внутри компании прямо в режиме чата и через API, или фиксированный набор источников на пользователя/роль достаточен?</w:t>
+        <w:t>11. Кастомизация выбора источников — нужно уточнить, что именно имеется в виду: (а) подключение/отключение целых каталогов данных внутри домена компании, или (б) выбор персоны/профиля пользователя с отдельным набором прав доступа к источникам? Это разные по объёму реализации задачи.</w:t>
       </w:r>
     </w:p>
     <w:p>
       <w:r>
-        <w:t>12. Персональные RAG-коллекции пользователей — нужна ли пользователям возможность самим создавать RAG-коллекции и делиться ими с коллегами (вместо текущего набора файлов), или это не актуально для Д8?</w:t>
+        <w:t>12. Персональные RAG-коллекции пользователей — нужно уточнить механику: имеется в виду фильтр по документам внутри уже существующей коллекции (сузить область поиска), или отдельная новая коллекция, которую пользователь создаёт и наполняет сам?</w:t>
       </w:r>
     </w:p>
     <w:p>
       <w:r>
-        <w:t>13. Упрощение заведения пользователей — что именно сейчас неудобно в процессе добавления новых пользователей на стороне Д8? (нужен конкретный сценарий, чтобы платформа могла спроектировать упрощение по делу)</w:t>
+        <w:t>13. Упрощение заведения пользователей — нужен не общий запрос, а конкретный кейс: как должен выглядеть процесс пошагово (кто инициирует, какие поля заполняются, кто подтверждает), чтобы платформа могла спроектировать решение по существу.</w:t>
       </w:r>
     </w:p>
     <w:p>

</xml_diff>

<commit_message>
Add executive summary (Главные тезисы) to D8 scope document
Co-Authored-By: Claude Sonnet 5 <noreply@anthropic.com>
Claude-Session: https://claude.ai/code/session_01DpSN8JwCJ3tg3JVUadr2zE
</commit_message>
<xml_diff>
--- a/docs/analysis/case-27-proekt-d8-skoup-i-voprosy.docx
+++ b/docs/analysis/case-27-proekt-d8-skoup-i-voprosy.docx
@@ -29,6 +29,150 @@
       </w:r>
       <w:r>
         <w:t>, Кейс 2 — Проект) к конкретному кандидату — АО «Инвестиционная компания Д8», единственному клиенту в базе, реально прошедшему пилот достаточно далеко, чтобы обсуждать масштабирование. Ниже — то, что уже известно из пилотного ТЗ и разбора мастер-ТЗ, что подтвердил заказчик в этой сессии, черновая карта волн проекта, и открытые вопросы, которые нужно закрыть до фазы П2 («Целевая архитектура и волны роллаута»).</w:t>
+      </w:r>
+    </w:p>
+    <w:p>
+      <w:r>
+        <w:t>---</w:t>
+      </w:r>
+    </w:p>
+    <w:p>
+      <w:pPr>
+        <w:pStyle w:val="Heading2"/>
+      </w:pPr>
+      <w:r>
+        <w:t>Главные тезисы</w:t>
+      </w:r>
+    </w:p>
+    <w:p>
+      <w:r>
+        <w:t xml:space="preserve">- </w:t>
+      </w:r>
+      <w:r>
+        <w:rPr>
+          <w:b/>
+        </w:rPr>
+        <w:t>Скоуп пилота остаётся полностью</w:t>
+      </w:r>
+      <w:r>
+        <w:t xml:space="preserve"> — КХД, ESB/CRM Bitrix24 и MCP-сервер никуда не выводятся. </w:t>
+      </w:r>
+      <w:r>
+        <w:rPr>
+          <w:b/>
+        </w:rPr>
+        <w:t>Расширяются только ESB и КХД</w:t>
+      </w:r>
+      <w:r>
+        <w:t xml:space="preserve"> (больше витрин и API, возможно шире периметр хранилища); «RAG-компании» исключён из скоупа как опечатка/дублирующее название (§1–2).</w:t>
+      </w:r>
+    </w:p>
+    <w:p>
+      <w:r>
+        <w:t xml:space="preserve">- </w:t>
+      </w:r>
+      <w:r>
+        <w:rPr>
+          <w:b/>
+        </w:rPr>
+        <w:t>Волны 1 и 2 подтверждены по порядку, но не по содержанию.</w:t>
+      </w:r>
+      <w:r>
+        <w:t xml:space="preserve"> Заказчик задал последовательность (сначала RAG-документы, потом КХД/ESB), но формулировка волны 1 допускает три разных толкования, а точный состав волны 2 (какие витрины/API) не назван. Волна 3+ полностью открыта — «уточнить какие дальше» (§3).</w:t>
+      </w:r>
+    </w:p>
+    <w:p>
+      <w:r>
+        <w:t xml:space="preserve">- </w:t>
+      </w:r>
+      <w:r>
+        <w:rPr>
+          <w:b/>
+        </w:rPr>
+        <w:t>Без 4 параметров по каждой волне трудоёмкость не оценить</w:t>
+      </w:r>
+      <w:r>
+        <w:t>: состав данных, количество витрин/коллекций, количество пользователей, количество ролей. Это не опция, а условие для старта фазы П2 — детальный чек-лист и рабочий шаблон сбора данных см. в §3.</w:t>
+      </w:r>
+    </w:p>
+    <w:p>
+      <w:r>
+        <w:t xml:space="preserve">- </w:t>
+      </w:r>
+      <w:r>
+        <w:rPr>
+          <w:b/>
+        </w:rPr>
+        <w:t>Из 11 пунктов реестра платформенных пожеланий Д8 нужно ответить только по 4</w:t>
+      </w:r>
+      <w:r>
+        <w:t xml:space="preserve"> («требуется от Д8») — остальные 7 либо уже в плане платформы на конкретный квартал, либо решаются внутри команды без участия заказчика (§4).</w:t>
+      </w:r>
+    </w:p>
+    <w:p>
+      <w:r>
+        <w:t xml:space="preserve">- </w:t>
+      </w:r>
+      <w:r>
+        <w:rPr>
+          <w:b/>
+        </w:rPr>
+        <w:t>К заказчику — 15 вопросов и 6 наших предложений</w:t>
+      </w:r>
+      <w:r>
+        <w:t xml:space="preserve"> с рабочей позицией по умолчанию (проще поправить готовое предложение, чем отвечать с нуля) — §5–6.</w:t>
+      </w:r>
+    </w:p>
+    <w:p>
+      <w:r>
+        <w:t xml:space="preserve">- </w:t>
+      </w:r>
+      <w:r>
+        <w:rPr>
+          <w:b/>
+        </w:rPr>
+        <w:t>Критично закрыть звонком, не перепиской:</w:t>
+      </w:r>
+      <w:r>
+        <w:t xml:space="preserve"> точное толкование волны 1 (три варианта слишком разные по объёму работ) — предложение 1 в §6.</w:t>
+      </w:r>
+    </w:p>
+    <w:p>
+      <w:r>
+        <w:t xml:space="preserve">- </w:t>
+      </w:r>
+      <w:r>
+        <w:rPr>
+          <w:b/>
+        </w:rPr>
+        <w:t>Пилот формально не прошёл все пороги приёмки</w:t>
+      </w:r>
+      <w:r>
+        <w:t xml:space="preserve"> (Сценарий 6: 67,4%/70%, Сценарий 4: 87,5%/95%, </w:t>
+      </w:r>
+      <w:r>
+        <w:rPr>
+          <w:rFonts w:ascii="Consolas" w:hAnsi="Consolas"/>
+          <w:sz w:val="20"/>
+        </w:rPr>
+        <w:t>case-21</w:t>
+      </w:r>
+      <w:r>
+        <w:t>) — предлагаем не ждать дозакрытия, а перенести оба пункта в список долга бизнес-кейса П1 (предложение 6, §6, вопрос 15).</w:t>
+      </w:r>
+    </w:p>
+    <w:p>
+      <w:r>
+        <w:t xml:space="preserve">- </w:t>
+      </w:r>
+      <w:r>
+        <w:rPr>
+          <w:b/>
+        </w:rPr>
+        <w:t>Архитектура пилота задокументирована отдельно</w:t>
+      </w:r>
+      <w:r>
+        <w:t xml:space="preserve"> (см. ниже) как факт-базис для сравнения с проектным расширением — не проектный скоуп.</w:t>
       </w:r>
     </w:p>
     <w:p>

</xml_diff>

<commit_message>
Turn wave goal/criteria into questions to the customer, add proposals slide
- Волновые карточки (пптx) и вопросы 2/4/8 (md) больше не содержат
  наших формулировок цели/критерия — это прямые вопросы к Д8: какая
  цель волны и какой критерий её достижения. Добавлено в xlsx (новые
  вопросы №2, №5, №9) и синхронизировано в md/docx (вопросы 1-18,
  полная renumbering всех перекрёстных ссылок).
- Новый слайд «Наши предложения» (6/7) — 6 рабочих позиций по
  умолчанию из §6 документа, на основе программы проекта.

Co-Authored-By: Claude Sonnet 5 <noreply@anthropic.com>
Claude-Session: https://claude.ai/code/session_01DpSN8JwCJ3tg3JVUadr2zE
</commit_message>
<xml_diff>
--- a/docs/analysis/case-27-proekt-d8-skoup-i-voprosy.docx
+++ b/docs/analysis/case-27-proekt-d8-skoup-i-voprosy.docx
@@ -117,10 +117,19 @@
         <w:rPr>
           <w:b/>
         </w:rPr>
-        <w:t>К заказчику — 15 вопросов и 6 наших предложений</w:t>
+        <w:t>К заказчику — 18 вопросов и 6 наших предложений</w:t>
       </w:r>
       <w:r>
-        <w:t xml:space="preserve"> с рабочей позицией по умолчанию (проще поправить готовое предложение, чем отвечать с нуля) — §5–6.</w:t>
+        <w:t xml:space="preserve"> с рабочей позицией по умолчанию (проще поправить готовое предложение, чем отвечать с нуля) — §5–6. Три из них — не про содержание волны, а прямой запрос к заказчику назвать </w:t>
+      </w:r>
+      <w:r>
+        <w:rPr>
+          <w:b/>
+        </w:rPr>
+        <w:t>цель волны и критерий её достижения</w:t>
+      </w:r>
+      <w:r>
+        <w:t xml:space="preserve"> (вопросы 2, 4, 8) — это должен сформулировать Д8, а не мы за него.</w:t>
       </w:r>
     </w:p>
     <w:p>
@@ -158,7 +167,7 @@
         <w:t>case-21</w:t>
       </w:r>
       <w:r>
-        <w:t>) — предлагаем не ждать дозакрытия, а перенести оба пункта в список долга бизнес-кейса П1 (предложение 6, §6, вопрос 15).</w:t>
+        <w:t>) — предлагаем не ждать дозакрытия, а перенести оба пункта в список долга бизнес-кейса П1 (предложение 6, §6, вопрос 18).</w:t>
       </w:r>
     </w:p>
     <w:p>
@@ -690,7 +699,7 @@
     </w:p>
     <w:p>
       <w:r>
-        <w:t>Источники из мастер-ТЗ, не входившие в пилот (Excel/CSV напрямую, Email, Confluence, отдельный back-office-коннектор) — по-прежнему не подтверждены и не затронуты этим решением ни в одну, ни в другую сторону (см. вопрос 9).</w:t>
+        <w:t>Источники из мастер-ТЗ, не входившие в пилот (Excel/CSV напрямую, Email, Confluence, отдельный back-office-коннектор) — по-прежнему не подтверждены и не затронуты этим решением ни в одну, ни в другую сторону (см. вопрос 12).</w:t>
       </w:r>
     </w:p>
     <w:p>
@@ -938,7 +947,7 @@
         <w:t>(а) Расширение самого документного корпуса</w:t>
       </w:r>
       <w:r>
-        <w:t xml:space="preserve"> — добавление типов документов, не входивших в пилот: Word/PDF из мастер-ТЗ (декларации, договоры ДУ, меморандумы, внутренние регламенты — §1.2, статус «не подтверждено»). Если это имелось в виду — волна 1 частично закрывает вопрос 9 ниже (Word/PDF-регламенты).</w:t>
+        <w:t xml:space="preserve"> — добавление типов документов, не входивших в пилот: Word/PDF из мастер-ТЗ (декларации, договоры ДУ, меморандумы, внутренние регламенты — §1.2, статус «не подтверждено»). Если это имелось в виду — волна 1 частично закрывает вопрос 12 ниже (Word/PDF-регламенты).</w:t>
       </w:r>
     </w:p>
     <w:p>
@@ -984,7 +993,7 @@
     </w:p>
     <w:p>
       <w:r>
-        <w:t>Содержание уже описано в §2. Технические открытые вопросы по этой волне — вопросы 1–3 в §5.</w:t>
+        <w:t>Содержание уже описано в §2. Технические открытые вопросы по этой волне — вопросы 5–8 в §5.</w:t>
       </w:r>
     </w:p>
     <w:p>
@@ -1007,12 +1016,12 @@
     </w:p>
     <w:p>
       <w:r>
-        <w:t>- Переход на динамические права доступа (вопрос 6), если к этому моменту готова платформенная сторона (реестр §4).</w:t>
+        <w:t>- Переход на динамические права доступа (вопрос 11), если к этому моменту готова платформенная сторона (реестр §4).</w:t>
       </w:r>
     </w:p>
     <w:p>
       <w:r>
-        <w:t>- Источники вне пилотной тройки (Email/Confluence/Excel-CSV) — если по вопросу 9 заказчик подтвердит их актуальность.</w:t>
+        <w:t>- Источники вне пилотной тройки (Email/Confluence/Excel-CSV) — если по вопросу 12 заказчик подтвердит их актуальность.</w:t>
       </w:r>
     </w:p>
     <w:p>
@@ -1030,7 +1039,7 @@
     </w:p>
     <w:p>
       <w:r>
-        <w:t xml:space="preserve">Оба вопроса «что входит в волну» (§5, вопросы 1 и 3) сейчас сформулированы как открытые — они спрашивают </w:t>
+        <w:t xml:space="preserve">Оба вопроса «что входит в волну» (§5, вопросы 1 и 5) сейчас сформулированы как открытые — они спрашивают </w:t>
       </w:r>
       <w:r>
         <w:rPr>
@@ -1280,7 +1289,7 @@
           </w:tcPr>
           <w:p>
             <w:r>
-              <w:t>Вопрос 3</w:t>
+              <w:t>Вопрос 5</w:t>
             </w:r>
           </w:p>
         </w:tc>
@@ -1312,7 +1321,7 @@
           </w:tcPr>
           <w:p>
             <w:r>
-              <w:t>Точное число витрин сверх пилотных 4 — сейчас вопрос 3 спрашивает список, но не просит явно назвать количество</w:t>
+              <w:t>Точное число витрин сверх пилотных 4 — сейчас вопрос 5 спрашивает список, но не просит явно назвать количество</w:t>
             </w:r>
           </w:p>
         </w:tc>
@@ -1322,7 +1331,7 @@
           </w:tcPr>
           <w:p>
             <w:r>
-              <w:t>Вопрос 3 — дополнить формулировку</w:t>
+              <w:t>Вопрос 5 — дополнить формулировку</w:t>
             </w:r>
           </w:p>
         </w:tc>
@@ -1364,7 +1373,7 @@
           </w:tcPr>
           <w:p>
             <w:r>
-              <w:t>Вопрос 4</w:t>
+              <w:t>Вопрос 6</w:t>
             </w:r>
           </w:p>
         </w:tc>
@@ -1406,7 +1415,7 @@
           </w:tcPr>
           <w:p>
             <w:r>
-              <w:t>Новый пункт — добавить к вопросу 6</w:t>
+              <w:t>Новый пункт — добавить к вопросу 9</w:t>
             </w:r>
           </w:p>
         </w:tc>
@@ -1448,7 +1457,7 @@
           </w:tcPr>
           <w:p>
             <w:r>
-              <w:t>Вопрос 6</w:t>
+              <w:t>Вопрос 9</w:t>
             </w:r>
           </w:p>
         </w:tc>
@@ -1688,7 +1697,7 @@
           </w:tcPr>
           <w:p>
             <w:r>
-              <w:t>Новый пункт — добавить к вопросу 6</w:t>
+              <w:t>Новый пункт — добавить к вопросу 9</w:t>
             </w:r>
           </w:p>
         </w:tc>
@@ -1730,7 +1739,7 @@
           </w:tcPr>
           <w:p>
             <w:r>
-              <w:t>Вопрос 6</w:t>
+              <w:t>Вопрос 9</w:t>
             </w:r>
           </w:p>
         </w:tc>
@@ -1744,7 +1753,7 @@
         <w:t>Как использовать:</w:t>
       </w:r>
       <w:r>
-        <w:t xml:space="preserve"> это рабочий шаблон сбора данных, не готовый вопрос заказчику — заполняется по итогам созвона по волне 1 (предложение 1, §6) и по ответам на вопросы 3–6. Тот же шаблон (4 параметра) переиспользуется для волны 3+, когда её содержание определится.</w:t>
+        <w:t xml:space="preserve"> это рабочий шаблон сбора данных, не готовый вопрос заказчику — заполняется по итогам созвона по волне 1 (предложение 1, §6) и по ответам на вопросы 5–9. Тот же шаблон (4 параметра) переиспользуется для волны 3+, когда её содержание определится.</w:t>
       </w:r>
     </w:p>
     <w:p>
@@ -2484,7 +2493,35 @@
     </w:p>
     <w:p>
       <w:r>
-        <w:t>2. Волна 3 и далее — есть ли уже примерное направление (роли, новые источники, промышленная эксплуатация), или это открытый вопрос до завершения волны 2?</w:t>
+        <w:t xml:space="preserve">2. </w:t>
+      </w:r>
+      <w:r>
+        <w:rPr>
+          <w:b/>
+        </w:rPr>
+        <w:t>Цель и критерий волны 1</w:t>
+      </w:r>
+      <w:r>
+        <w:t xml:space="preserve"> — какой результат для бизнеса должна дать волна 1: что именно изменится для пользователей или процессов? По каким признакам вы будете считать волну 1 завершённой и успешной? *(это должен сформулировать Д8 — не готовая формулировка от нас, а прямой запрос к заказчику)*</w:t>
+      </w:r>
+    </w:p>
+    <w:p>
+      <w:r>
+        <w:t>3. Волна 3 и далее — есть ли уже примерное направление (роли, новые источники, промышленная эксплуатация), или это открытый вопрос до завершения волны 2?</w:t>
+      </w:r>
+    </w:p>
+    <w:p>
+      <w:r>
+        <w:t xml:space="preserve">4. </w:t>
+      </w:r>
+      <w:r>
+        <w:rPr>
+          <w:b/>
+        </w:rPr>
+        <w:t>Цель и критерий волны 3+</w:t>
+      </w:r>
+      <w:r>
+        <w:t xml:space="preserve"> — когда направление определится, какая бизнес-цель будет стоять за этой волной, и какими критериями вы будете руководствоваться при выборе (что считать успехом)?</w:t>
       </w:r>
     </w:p>
     <w:p>
@@ -2497,7 +2534,7 @@
     </w:p>
     <w:p>
       <w:r>
-        <w:t>3. Какие конкретно витрины данных нужно добавить в ESB сверх текущего среза CRM (Bitrix24)? Нужен список с владельцами на стороне Д8 — и явное число: сколько витрин добавляется сверх пилотных 4 (</w:t>
+        <w:t>5. Какие конкретно витрины данных нужно добавить в ESB сверх текущего среза CRM (Bitrix24)? Нужен список с владельцами на стороне Д8 — и явное число: сколько витрин добавляется сверх пилотных 4 (</w:t>
       </w:r>
       <w:r>
         <w:rPr>
@@ -2542,12 +2579,26 @@
     </w:p>
     <w:p>
       <w:r>
-        <w:t>4. Какие конкретно API нужно открыть через шину — по каждому: система-источник, формат (REST/SOAP/др.), кто на стороне Д8 отвечает за контракт API.</w:t>
+        <w:t>6. Какие конкретно API нужно открыть через шину — по каждому: система-источник, формат (REST/SOAP/др.), кто на стороне Д8 отвечает за контракт API.</w:t>
       </w:r>
     </w:p>
     <w:p>
       <w:r>
-        <w:t>5. КХД — расширяется ли состав таблиц/витрин внутри самого хранилища, или его периметр остаётся как в пилоте?</w:t>
+        <w:t>7. КХД — расширяется ли состав таблиц/витрин внутри самого хранилища, или его периметр остаётся как в пилоте?</w:t>
+      </w:r>
+    </w:p>
+    <w:p>
+      <w:r>
+        <w:t xml:space="preserve">8. </w:t>
+      </w:r>
+      <w:r>
+        <w:rPr>
+          <w:b/>
+        </w:rPr>
+        <w:t>Цель и критерий волны 2</w:t>
+      </w:r>
+      <w:r>
+        <w:t xml:space="preserve"> — какую бизнес-задачу решает расширение ESB/КХД: что станет возможным, чего нет сейчас? По какому набору проверок/сценариев вы примете волну 2 как завершённую?</w:t>
       </w:r>
     </w:p>
     <w:p>
@@ -2560,17 +2611,17 @@
     </w:p>
     <w:p>
       <w:r>
-        <w:t>6. Реальная оргструктура для проекта: список подразделений/ролей с числом пользователей в каждой (не гипотетическая таблица из мастер-ТЗ, а факт) — нужна для карты волн 3+. Отдельно по волнам 1 и 2: сколько пользователей и какие именно роли получают доступ в рамках именно этой волны (не общий штат) — тот же контур, что в пилоте (до 20 пользователей, 2 роли), или шире.</w:t>
+        <w:t>9. Реальная оргструктура для проекта: список подразделений/ролей с числом пользователей в каждой (не гипотетическая таблица из мастер-ТЗ, а факт) — нужна для карты волн 3+. Отдельно по волнам 1 и 2: сколько пользователей и какие именно роли получают доступ в рамках именно этой волны (не общий штат) — тот же контур, что в пилоте (до 20 пользователей, 2 роли), или шире.</w:t>
       </w:r>
     </w:p>
     <w:p>
       <w:r>
-        <w:t>7. Разграничение прав «compliance видит своё, менеджер — своих клиентов» (п. 3.2 мастер-ТЗ, помечено «опционально в v2») — обязательное требование для проекта или можно оставить на будущее?</w:t>
+        <w:t>10. Разграничение прав «compliance видит своё, менеджер — своих клиентов» (п. 3.2 мастер-ТЗ, помечено «опционально в v2») — обязательное требование для проекта или можно оставить на будущее?</w:t>
       </w:r>
     </w:p>
     <w:p>
       <w:r>
-        <w:t>8. Права доступа сотрудников сейчас фиксированы по статичному списку политик. Для проекта это должно стать динамическим через API — но нужна точная схема процесса: права хранятся и администрируются внутри самой платформы (и меняются там же), или платформа только получает их из внешней системы-источника через API и применяет как есть? Если второе — какая система источник истины (HR-система, Bitrix24, отдельный IAM) и как часто права обновляются? *(= пункт реестра «Обновление информации о правах доступа...», Уточнить у заказчика)*</w:t>
+        <w:t>11. Права доступа сотрудников сейчас фиксированы по статичному списку политик. Для проекта это должно стать динамическим через API — но нужна точная схема процесса: права хранятся и администрируются внутри самой платформы (и меняются там же), или платформа только получает их из внешней системы-источника через API и применяет как есть? Если второе — какая система источник истины (HR-система, Bitrix24, отдельный IAM) и как часто права обновляются? *(= пункт реестра «Обновление информации о правах доступа...», Уточнить у заказчика)*</w:t>
       </w:r>
     </w:p>
     <w:p>
@@ -2583,12 +2634,12 @@
     </w:p>
     <w:p>
       <w:r>
-        <w:t>9. Email, Word/PDF-регламенты, Confluence из мастер-ТЗ (§1.2) — они не входили в пилот. Подтверждается ли, что они НЕ входят и в проект (за вычетом того, что может решиться толкованием волны 1(а)), или это отдельный вопрос, который ещё предстоит решить?</w:t>
+        <w:t>12. Email, Word/PDF-регламенты, Confluence из мастер-ТЗ (§1.2) — они не входили в пилот. Подтверждается ли, что они НЕ входят и в проект (за вычетом того, что может решиться толкованием волны 1(а)), или это отдельный вопрос, который ещё предстоит решить?</w:t>
       </w:r>
     </w:p>
     <w:p>
       <w:r>
-        <w:t>10. Email в мастер-ТЗ помечен Must Have, но тест-кейсы (TC-EMAIL) отсутствовали уже в пилоте — снимается ли это требование в проекте или переносится?</w:t>
+        <w:t>13. Email в мастер-ТЗ помечен Must Have, но тест-кейсы (TC-EMAIL) отсутствовали уже в пилоте — снимается ли это требование в проекте или переносится?</w:t>
       </w:r>
     </w:p>
     <w:p>
@@ -2601,17 +2652,17 @@
     </w:p>
     <w:p>
       <w:r>
-        <w:t>11. Кастомизация выбора источников — нужно уточнить, что именно имеется в виду: (а) подключение/отключение целых каталогов данных внутри домена компании, или (б) выбор персоны/профиля пользователя с отдельным набором прав доступа к источникам? Это разные по объёму реализации задачи.</w:t>
+        <w:t>14. Кастомизация выбора источников — нужно уточнить, что именно имеется в виду: (а) подключение/отключение целых каталогов данных внутри домена компании, или (б) выбор персоны/профиля пользователя с отдельным набором прав доступа к источникам? Это разные по объёму реализации задачи.</w:t>
       </w:r>
     </w:p>
     <w:p>
       <w:r>
-        <w:t>12. Персональные RAG-коллекции пользователей — нужно уточнить механику: имеется в виду фильтр по документам внутри уже существующей коллекции (сузить область поиска), или отдельная новая коллекция, которую пользователь создаёт и наполняет сам?</w:t>
+        <w:t>15. Персональные RAG-коллекции пользователей — нужно уточнить механику: имеется в виду фильтр по документам внутри уже существующей коллекции (сузить область поиска), или отдельная новая коллекция, которую пользователь создаёт и наполняет сам?</w:t>
       </w:r>
     </w:p>
     <w:p>
       <w:r>
-        <w:t>13. Упрощение заведения пользователей — нужен не общий запрос, а конкретный кейс: как должен выглядеть процесс пошагово (кто инициирует, какие поля заполняются, кто подтверждает), чтобы платформа могла спроектировать решение по существу.</w:t>
+        <w:t>16. Упрощение заведения пользователей — нужен не общий запрос, а конкретный кейс: как должен выглядеть процесс пошагово (кто инициирует, какие поля заполняются, кто подтверждает), чтобы платформа могла спроектировать решение по существу.</w:t>
       </w:r>
     </w:p>
     <w:p>
@@ -2624,12 +2675,12 @@
     </w:p>
     <w:p>
       <w:r>
-        <w:t>14. Кто со стороны Д8 — новый владелец процесса на фазе П4 (промышленная эксплуатация)? Тот же технический контакт, что в пилоте, или отдельная выделенная роль/команда?</w:t>
+        <w:t>17. Кто со стороны Д8 — новый владелец процесса на фазе П4 (промышленная эксплуатация)? Тот же технический контакт, что в пилоте, или отдельная выделенная роль/команда?</w:t>
       </w:r>
     </w:p>
     <w:p>
       <w:r>
-        <w:t xml:space="preserve">15. Формальный критерий перехода в проект: пилот по </w:t>
+        <w:t xml:space="preserve">18. Формальный критерий перехода в проект: пилот по </w:t>
       </w:r>
       <w:r>
         <w:rPr>
@@ -2685,7 +2736,7 @@
         <w:t>Решение по ESB/КХД (волна 2) зафиксировать письменно как есть — расширение, не сужение.</w:t>
       </w:r>
       <w:r>
-        <w:t xml:space="preserve"> Предлагаем формулировку для проектного ТЗ: «Все 3 пилотных источника (КХД, ESB/CRM, MCP-сервер) остаются в проекте; ESB и КХД получают расширение (витрины/API), MCP-сервер — на пилотном уровне; «RAG-компании» исключён из скоупа как опечатка/дублирующее название». Источники вне пилотной тройки — отдельный, пока не решённый вопрос (вопрос 9), не путать с этим решением.</w:t>
+        <w:t xml:space="preserve"> Предлагаем формулировку для проектного ТЗ: «Все 3 пилотных источника (КХД, ESB/CRM, MCP-сервер) остаются в проекте; ESB и КХД получают расширение (витрины/API), MCP-сервер — на пилотном уровне; «RAG-компании» исключён из скоупа как опечатка/дублирующее название». Источники вне пилотной тройки — отдельный, пока не решённый вопрос (вопрос 12), не путать с этим решением.</w:t>
       </w:r>
     </w:p>
     <w:p>
@@ -2710,7 +2761,7 @@
         <w:rPr>
           <w:b/>
         </w:rPr>
-        <w:t>Динамические права доступа (вопрос 8) — не блокировать волну 2, но зафиксировать как gate для поздних волн.</w:t>
+        <w:t>Динамические права доступа (вопрос 11) — не блокировать волну 2, но зафиксировать как gate для поздних волн.</w:t>
       </w:r>
       <w:r>
         <w:t xml:space="preserve"> На стороне платформы срока пока нет («Уточнить у заказчика» в реестре — платформа тоже ждёт ответа Д8). Предлагаем: волну 2 запускать на статичной модели прав (как в пилоте), но заложить в архитектуру совместимость с будущим переходом на API-модель — и явно зафиксировать, что волны с данными повышенной чувствительности (комплаенс, бэк-офис, кандидаты для волны 3+) не начинаются, пока это не готово с обеих сторон (ответ Д8 + реализация платформы). Отдельно: «Обновление данных в RAG через API» — уже в плане платформы на 4 квартал, для этого пункта отдельного вопроса заказчику не нужно, только держать в поле зрения срок.</w:t>
@@ -2727,7 +2778,7 @@
         <w:t>Для волны 3+, если это роллаут по ролям — предлагаем порядок по умолчанию: фронт-офис → аналитики/портфельные управляющие → руководство → бэк-офис.</w:t>
       </w:r>
       <w:r>
-        <w:t xml:space="preserve"> Обоснование: фронт-офис — единственная роль, реально протестированная в пилоте (тот же кейс D8-014), значит первая среди ролевых волн — наименьший технический риск. Бэк-офис — последним: самые чувствительные данные (сделки, документы), и именно туда упирается вопрос 8 (динамические права доступа).</w:t>
+        <w:t xml:space="preserve"> Обоснование: фронт-офис — единственная роль, реально протестированная в пилоте (тот же кейс D8-014), значит первая среди ролевых волн — наименьший технический риск. Бэк-офис — последним: самые чувствительные данные (сделки, документы), и именно туда упирается вопрос 11 (динамические права доступа).</w:t>
       </w:r>
     </w:p>
     <w:p>
@@ -2738,7 +2789,7 @@
         <w:rPr>
           <w:b/>
         </w:rPr>
-        <w:t>Критерий перехода (вопрос 15) — предлагаем не ждать дозакрытия сценариев 6 и 4.</w:t>
+        <w:t>Критерий перехода (вопрос 18) — предлагаем не ждать дозакрытия сценариев 6 и 4.</w:t>
       </w:r>
       <w:r>
         <w:t xml:space="preserve"> По методике (§4.1 Кейса 2) переход не требует 100% pass. Предлагаем перенести оба открытых пункта в явный «список долга» бизнес-кейса П1 — с обязательством закрыть их в рамках волны 1 или 2, а не тихо забыть при переходе в проект.</w:t>
@@ -2844,7 +2895,7 @@
         <w:t>docs/analysis/case-21-pereotsenka-scenariev-6-i-4-po-kriteriyam-priemki.md</w:t>
       </w:r>
       <w:r>
-        <w:t>](case-21-pereotsenka-scenariev-6-i-4-po-kriteriyam-priemki.md) — формальный статус приёмки пилота (вопрос 15).</w:t>
+        <w:t>](case-21-pereotsenka-scenariev-6-i-4-po-kriteriyam-priemki.md) — формальный статус приёмки пилота (вопрос 18).</w:t>
       </w:r>
     </w:p>
     <w:sectPr>

</xml_diff>